<commit_message>
dm lab 5 and 6
Co-authored-by: Copilot <copilot@github.com>
</commit_message>
<xml_diff>
--- a/digital-modeling/5 Лаба/Отчет.docx
+++ b/digital-modeling/5 Лаба/Отчет.docx
@@ -61,7 +61,35 @@
           <w:lang w:eastAsia="ru-RU"/>
           <w14:ligatures w14:val="none"/>
         </w:rPr>
-        <w:t>Федеральное государственное бюджетное образовательное учреждение высшего образования «Российский химико-технологический университет имени Д.И. Менделеева»</w:t>
+        <w:t xml:space="preserve">Федеральное государственное бюджетное образовательное учреждение высшего образования «Российский химико-технологический университет имени </w:t>
+      </w:r>
+      <w:proofErr w:type="gramStart"/>
+      <w:r>
+        <w:rPr>
+          <w:rFonts w:ascii="Times New Roman" w:eastAsia="Times New Roman" w:hAnsi="Times New Roman" w:cs="Times New Roman"/>
+          <w:bCs/>
+          <w:color w:val="00000A"/>
+          <w:kern w:val="0"/>
+          <w:sz w:val="28"/>
+          <w:szCs w:val="22"/>
+          <w:lang w:eastAsia="ru-RU"/>
+          <w14:ligatures w14:val="none"/>
+        </w:rPr>
+        <w:t>Д.И.</w:t>
+      </w:r>
+      <w:proofErr w:type="gramEnd"/>
+      <w:r>
+        <w:rPr>
+          <w:rFonts w:ascii="Times New Roman" w:eastAsia="Times New Roman" w:hAnsi="Times New Roman" w:cs="Times New Roman"/>
+          <w:bCs/>
+          <w:color w:val="00000A"/>
+          <w:kern w:val="0"/>
+          <w:sz w:val="28"/>
+          <w:szCs w:val="22"/>
+          <w:lang w:eastAsia="ru-RU"/>
+          <w14:ligatures w14:val="none"/>
+        </w:rPr>
+        <w:t xml:space="preserve"> Менделеева»</w:t>
       </w:r>
     </w:p>
     <w:p>
@@ -283,7 +311,83 @@
           <w:lang w:eastAsia="ru-RU"/>
           <w14:ligatures w14:val="none"/>
         </w:rPr>
-        <w:t>«Разработка ML-модели для предсказания физико-химического свойства (Cp) и анализ зависимости Cp(T, P)»</w:t>
+        <w:t>«Разработка ML-модели для предсказания физико-химического свойства (</w:t>
+      </w:r>
+      <w:proofErr w:type="spellStart"/>
+      <w:r>
+        <w:rPr>
+          <w:rFonts w:ascii="Times New Roman" w:eastAsia="Times New Roman" w:hAnsi="Times New Roman" w:cs="Times New Roman"/>
+          <w:b/>
+          <w:bCs/>
+          <w:color w:val="00000A"/>
+          <w:kern w:val="0"/>
+          <w:sz w:val="28"/>
+          <w:szCs w:val="28"/>
+          <w:lang w:eastAsia="ru-RU"/>
+          <w14:ligatures w14:val="none"/>
+        </w:rPr>
+        <w:t>Cp</w:t>
+      </w:r>
+      <w:proofErr w:type="spellEnd"/>
+      <w:r>
+        <w:rPr>
+          <w:rFonts w:ascii="Times New Roman" w:eastAsia="Times New Roman" w:hAnsi="Times New Roman" w:cs="Times New Roman"/>
+          <w:b/>
+          <w:bCs/>
+          <w:color w:val="00000A"/>
+          <w:kern w:val="0"/>
+          <w:sz w:val="28"/>
+          <w:szCs w:val="28"/>
+          <w:lang w:eastAsia="ru-RU"/>
+          <w14:ligatures w14:val="none"/>
+        </w:rPr>
+        <w:t xml:space="preserve">) и анализ зависимости </w:t>
+      </w:r>
+      <w:proofErr w:type="spellStart"/>
+      <w:proofErr w:type="gramStart"/>
+      <w:r>
+        <w:rPr>
+          <w:rFonts w:ascii="Times New Roman" w:eastAsia="Times New Roman" w:hAnsi="Times New Roman" w:cs="Times New Roman"/>
+          <w:b/>
+          <w:bCs/>
+          <w:color w:val="00000A"/>
+          <w:kern w:val="0"/>
+          <w:sz w:val="28"/>
+          <w:szCs w:val="28"/>
+          <w:lang w:eastAsia="ru-RU"/>
+          <w14:ligatures w14:val="none"/>
+        </w:rPr>
+        <w:t>Cp</w:t>
+      </w:r>
+      <w:proofErr w:type="spellEnd"/>
+      <w:r>
+        <w:rPr>
+          <w:rFonts w:ascii="Times New Roman" w:eastAsia="Times New Roman" w:hAnsi="Times New Roman" w:cs="Times New Roman"/>
+          <w:b/>
+          <w:bCs/>
+          <w:color w:val="00000A"/>
+          <w:kern w:val="0"/>
+          <w:sz w:val="28"/>
+          <w:szCs w:val="28"/>
+          <w:lang w:eastAsia="ru-RU"/>
+          <w14:ligatures w14:val="none"/>
+        </w:rPr>
+        <w:t>(</w:t>
+      </w:r>
+      <w:proofErr w:type="gramEnd"/>
+      <w:r>
+        <w:rPr>
+          <w:rFonts w:ascii="Times New Roman" w:eastAsia="Times New Roman" w:hAnsi="Times New Roman" w:cs="Times New Roman"/>
+          <w:b/>
+          <w:bCs/>
+          <w:color w:val="00000A"/>
+          <w:kern w:val="0"/>
+          <w:sz w:val="28"/>
+          <w:szCs w:val="28"/>
+          <w:lang w:eastAsia="ru-RU"/>
+          <w14:ligatures w14:val="none"/>
+        </w:rPr>
+        <w:t>T, P)»</w:t>
       </w:r>
     </w:p>
     <w:p>
@@ -450,7 +554,32 @@
           <w14:ligatures w14:val="none"/>
         </w:rPr>
         <w:tab/>
-        <w:t>Митричев И.И.</w:t>
+      </w:r>
+      <w:proofErr w:type="spellStart"/>
+      <w:r>
+        <w:rPr>
+          <w:rFonts w:ascii="Times New Roman" w:eastAsia="Times New Roman" w:hAnsi="Times New Roman" w:cs="Times New Roman"/>
+          <w:color w:val="00000A"/>
+          <w:kern w:val="0"/>
+          <w:sz w:val="28"/>
+          <w:szCs w:val="28"/>
+          <w:lang w:eastAsia="ru-RU"/>
+          <w14:ligatures w14:val="none"/>
+        </w:rPr>
+        <w:t>Митричев</w:t>
+      </w:r>
+      <w:proofErr w:type="spellEnd"/>
+      <w:r>
+        <w:rPr>
+          <w:rFonts w:ascii="Times New Roman" w:eastAsia="Times New Roman" w:hAnsi="Times New Roman" w:cs="Times New Roman"/>
+          <w:color w:val="00000A"/>
+          <w:kern w:val="0"/>
+          <w:sz w:val="28"/>
+          <w:szCs w:val="28"/>
+          <w:lang w:eastAsia="ru-RU"/>
+          <w14:ligatures w14:val="none"/>
+        </w:rPr>
+        <w:t xml:space="preserve"> И.И.</w:t>
       </w:r>
     </w:p>
     <w:p>
@@ -576,7 +705,33 @@
           <w14:ligatures w14:val="none"/>
         </w:rPr>
         <w:tab/>
-        <w:t xml:space="preserve">          Папихин В. Е.</w:t>
+        <w:t xml:space="preserve">          </w:t>
+      </w:r>
+      <w:proofErr w:type="spellStart"/>
+      <w:r>
+        <w:rPr>
+          <w:rFonts w:ascii="Times New Roman" w:eastAsia="Times New Roman" w:hAnsi="Times New Roman" w:cs="Times New Roman"/>
+          <w:color w:val="00000A"/>
+          <w:kern w:val="0"/>
+          <w:sz w:val="28"/>
+          <w:szCs w:val="22"/>
+          <w:lang w:eastAsia="ru-RU"/>
+          <w14:ligatures w14:val="none"/>
+        </w:rPr>
+        <w:t>Папихин</w:t>
+      </w:r>
+      <w:proofErr w:type="spellEnd"/>
+      <w:r>
+        <w:rPr>
+          <w:rFonts w:ascii="Times New Roman" w:eastAsia="Times New Roman" w:hAnsi="Times New Roman" w:cs="Times New Roman"/>
+          <w:color w:val="00000A"/>
+          <w:kern w:val="0"/>
+          <w:sz w:val="28"/>
+          <w:szCs w:val="22"/>
+          <w:lang w:eastAsia="ru-RU"/>
+          <w14:ligatures w14:val="none"/>
+        </w:rPr>
+        <w:t xml:space="preserve"> В. Е.</w:t>
       </w:r>
     </w:p>
     <w:p>
@@ -873,7 +1028,61 @@
           <w:sz w:val="28"/>
           <w:szCs w:val="28"/>
         </w:rPr>
-        <w:t xml:space="preserve"> (модель Пенга-Робинсона для газовой фазы и модель modified UNIFAC (Dortmund) для жидкой фазы),</w:t>
+        <w:t xml:space="preserve"> (модель </w:t>
+      </w:r>
+      <w:proofErr w:type="spellStart"/>
+      <w:r>
+        <w:rPr>
+          <w:color w:val="000000"/>
+          <w:sz w:val="28"/>
+          <w:szCs w:val="28"/>
+        </w:rPr>
+        <w:t>Пенга</w:t>
+      </w:r>
+      <w:proofErr w:type="spellEnd"/>
+      <w:r>
+        <w:rPr>
+          <w:color w:val="000000"/>
+          <w:sz w:val="28"/>
+          <w:szCs w:val="28"/>
+        </w:rPr>
+        <w:t xml:space="preserve">-Робинсона для газовой фазы и модель </w:t>
+      </w:r>
+      <w:proofErr w:type="spellStart"/>
+      <w:r>
+        <w:rPr>
+          <w:color w:val="000000"/>
+          <w:sz w:val="28"/>
+          <w:szCs w:val="28"/>
+        </w:rPr>
+        <w:t>modified</w:t>
+      </w:r>
+      <w:proofErr w:type="spellEnd"/>
+      <w:r>
+        <w:rPr>
+          <w:color w:val="000000"/>
+          <w:sz w:val="28"/>
+          <w:szCs w:val="28"/>
+        </w:rPr>
+        <w:t xml:space="preserve"> UNIFAC (</w:t>
+      </w:r>
+      <w:proofErr w:type="spellStart"/>
+      <w:r>
+        <w:rPr>
+          <w:color w:val="000000"/>
+          <w:sz w:val="28"/>
+          <w:szCs w:val="28"/>
+        </w:rPr>
+        <w:t>Dortmund</w:t>
+      </w:r>
+      <w:proofErr w:type="spellEnd"/>
+      <w:r>
+        <w:rPr>
+          <w:color w:val="000000"/>
+          <w:sz w:val="28"/>
+          <w:szCs w:val="28"/>
+        </w:rPr>
+        <w:t>) для жидкой фазы),</w:t>
       </w:r>
     </w:p>
     <w:p>
@@ -930,7 +1139,25 @@
           <w:sz w:val="28"/>
           <w:szCs w:val="28"/>
         </w:rPr>
-        <w:t>3) построить T-x диаграмму при P = 1 бар, отметить на ней все фазы и чистые компоненты. Определите тип диаграммы из изученных и отклонение от идеальности (например, «диаграмма кипения с азеотропом с положительным отклонением от закона Рауля»),</w:t>
+        <w:t xml:space="preserve">3) построить T-x диаграмму при P = 1 бар, отметить на ней все фазы и чистые компоненты. Определите тип диаграммы из изученных и отклонение от идеальности (например, «диаграмма кипения с </w:t>
+      </w:r>
+      <w:proofErr w:type="spellStart"/>
+      <w:r>
+        <w:rPr>
+          <w:color w:val="000000"/>
+          <w:sz w:val="28"/>
+          <w:szCs w:val="28"/>
+        </w:rPr>
+        <w:t>азеотропом</w:t>
+      </w:r>
+      <w:proofErr w:type="spellEnd"/>
+      <w:r>
+        <w:rPr>
+          <w:color w:val="000000"/>
+          <w:sz w:val="28"/>
+          <w:szCs w:val="28"/>
+        </w:rPr>
+        <w:t xml:space="preserve"> с положительным отклонением от закона Рауля»),</w:t>
       </w:r>
     </w:p>
     <w:p>
@@ -949,7 +1176,43 @@
           <w:sz w:val="28"/>
           <w:szCs w:val="28"/>
         </w:rPr>
-        <w:t xml:space="preserve">4) поставить фигуративную точку D на T-x диаграмме в двухфазной области. Определите равновесные составы фаз, определяемые фигуративной точкой D, определите долю каждой фазы по правилу рычага. Проведите анализ процесса нагревания эквимолярной (50:50) смеси жидкостей вплоть до образования эквимолярного пара (см. материал </w:t>
+        <w:t xml:space="preserve">4) поставить фигуративную точку D на T-x диаграмме в двухфазной области. Определите равновесные составы фаз, определяемые фигуративной точкой D, определите долю каждой фазы по правилу рычага. Проведите анализ процесса нагревания </w:t>
+      </w:r>
+      <w:proofErr w:type="spellStart"/>
+      <w:r>
+        <w:rPr>
+          <w:color w:val="000000"/>
+          <w:sz w:val="28"/>
+          <w:szCs w:val="28"/>
+        </w:rPr>
+        <w:t>эквимолярной</w:t>
+      </w:r>
+      <w:proofErr w:type="spellEnd"/>
+      <w:r>
+        <w:rPr>
+          <w:color w:val="000000"/>
+          <w:sz w:val="28"/>
+          <w:szCs w:val="28"/>
+        </w:rPr>
+        <w:t xml:space="preserve"> (50:50) смеси жидкостей вплоть до образования </w:t>
+      </w:r>
+      <w:proofErr w:type="spellStart"/>
+      <w:r>
+        <w:rPr>
+          <w:color w:val="000000"/>
+          <w:sz w:val="28"/>
+          <w:szCs w:val="28"/>
+        </w:rPr>
+        <w:t>эквимолярного</w:t>
+      </w:r>
+      <w:proofErr w:type="spellEnd"/>
+      <w:r>
+        <w:rPr>
+          <w:color w:val="000000"/>
+          <w:sz w:val="28"/>
+          <w:szCs w:val="28"/>
+        </w:rPr>
+        <w:t xml:space="preserve"> пара (см. материал </w:t>
       </w:r>
       <w:r>
         <w:rPr>
@@ -1082,7 +1345,43 @@
           <w:sz w:val="28"/>
           <w:szCs w:val="28"/>
         </w:rPr>
-        <w:t>Для каждого значения температуры: возьмите равновесные x и y с диаграммы vle-calc.com, посчитайте z=x+y/2, и выполните flash-расчет в программе при начальной концентрации z. Отдельно посчитайте абсолютную ошибку по предсказанным x и по y (относительно взятых с диаграммы с сайта). Если модель предсказывает наличие только одной фазы, то по второй фазе считается, что модель предсказала результат y=0, x=0.</w:t>
+        <w:t>Для каждого значения температуры: возьмите равновесные x и y с диаграммы vle-calc.com, посчитайте z=</w:t>
+      </w:r>
+      <w:proofErr w:type="spellStart"/>
+      <w:r>
+        <w:rPr>
+          <w:color w:val="000000"/>
+          <w:sz w:val="28"/>
+          <w:szCs w:val="28"/>
+        </w:rPr>
+        <w:t>x+y</w:t>
+      </w:r>
+      <w:proofErr w:type="spellEnd"/>
+      <w:r>
+        <w:rPr>
+          <w:color w:val="000000"/>
+          <w:sz w:val="28"/>
+          <w:szCs w:val="28"/>
+        </w:rPr>
+        <w:t xml:space="preserve">/2, и выполните </w:t>
+      </w:r>
+      <w:proofErr w:type="spellStart"/>
+      <w:r>
+        <w:rPr>
+          <w:color w:val="000000"/>
+          <w:sz w:val="28"/>
+          <w:szCs w:val="28"/>
+        </w:rPr>
+        <w:t>flash</w:t>
+      </w:r>
+      <w:proofErr w:type="spellEnd"/>
+      <w:r>
+        <w:rPr>
+          <w:color w:val="000000"/>
+          <w:sz w:val="28"/>
+          <w:szCs w:val="28"/>
+        </w:rPr>
+        <w:t>-расчет в программе при начальной концентрации z. Отдельно посчитайте абсолютную ошибку по предсказанным x и по y (относительно взятых с диаграммы с сайта). Если модель предсказывает наличие только одной фазы, то по второй фазе считается, что модель предсказала результат y=0, x=0.</w:t>
       </w:r>
     </w:p>
     <w:p>
@@ -1127,7 +1426,59 @@
           <w:lang w:eastAsia="ru-RU"/>
           <w14:ligatures w14:val="none"/>
         </w:rPr>
-        <w:t xml:space="preserve"> (модель Пенга-Робинсона для газовой и 1-2 жидких фаз)</w:t>
+        <w:t xml:space="preserve"> (модель </w:t>
+      </w:r>
+      <w:proofErr w:type="spellStart"/>
+      <w:r>
+        <w:rPr>
+          <w:rFonts w:ascii="Times New Roman" w:eastAsia="Times New Roman" w:hAnsi="Times New Roman" w:cs="Times New Roman"/>
+          <w:color w:val="00000A"/>
+          <w:kern w:val="0"/>
+          <w:sz w:val="28"/>
+          <w:szCs w:val="28"/>
+          <w:lang w:eastAsia="ru-RU"/>
+          <w14:ligatures w14:val="none"/>
+        </w:rPr>
+        <w:t>Пенга</w:t>
+      </w:r>
+      <w:proofErr w:type="spellEnd"/>
+      <w:r>
+        <w:rPr>
+          <w:rFonts w:ascii="Times New Roman" w:eastAsia="Times New Roman" w:hAnsi="Times New Roman" w:cs="Times New Roman"/>
+          <w:color w:val="00000A"/>
+          <w:kern w:val="0"/>
+          <w:sz w:val="28"/>
+          <w:szCs w:val="28"/>
+          <w:lang w:eastAsia="ru-RU"/>
+          <w14:ligatures w14:val="none"/>
+        </w:rPr>
+        <w:t xml:space="preserve">-Робинсона для газовой и </w:t>
+      </w:r>
+      <w:proofErr w:type="gramStart"/>
+      <w:r>
+        <w:rPr>
+          <w:rFonts w:ascii="Times New Roman" w:eastAsia="Times New Roman" w:hAnsi="Times New Roman" w:cs="Times New Roman"/>
+          <w:color w:val="00000A"/>
+          <w:kern w:val="0"/>
+          <w:sz w:val="28"/>
+          <w:szCs w:val="28"/>
+          <w:lang w:eastAsia="ru-RU"/>
+          <w14:ligatures w14:val="none"/>
+        </w:rPr>
+        <w:t>1-2</w:t>
+      </w:r>
+      <w:proofErr w:type="gramEnd"/>
+      <w:r>
+        <w:rPr>
+          <w:rFonts w:ascii="Times New Roman" w:eastAsia="Times New Roman" w:hAnsi="Times New Roman" w:cs="Times New Roman"/>
+          <w:color w:val="00000A"/>
+          <w:kern w:val="0"/>
+          <w:sz w:val="28"/>
+          <w:szCs w:val="28"/>
+          <w:lang w:eastAsia="ru-RU"/>
+          <w14:ligatures w14:val="none"/>
+        </w:rPr>
+        <w:t xml:space="preserve"> жидких фаз)</w:t>
       </w:r>
     </w:p>
     <w:p>
@@ -1264,7 +1615,33 @@
           <w:lang w:eastAsia="ru-RU"/>
           <w14:ligatures w14:val="none"/>
         </w:rPr>
-        <w:t>Выберите эту смесь в книге BIPJ…xlsx, лист 1. Подставьте туда значения x (жидкость!) и y (пар!) – не перепутайте их местами.</w:t>
+        <w:t>Выберите эту смесь в книге BIPJ…</w:t>
+      </w:r>
+      <w:proofErr w:type="spellStart"/>
+      <w:r>
+        <w:rPr>
+          <w:rFonts w:ascii="Times New Roman" w:eastAsia="Times New Roman" w:hAnsi="Times New Roman" w:cs="Times New Roman"/>
+          <w:color w:val="00000A"/>
+          <w:kern w:val="0"/>
+          <w:sz w:val="28"/>
+          <w:szCs w:val="28"/>
+          <w:lang w:eastAsia="ru-RU"/>
+          <w14:ligatures w14:val="none"/>
+        </w:rPr>
+        <w:t>xlsx</w:t>
+      </w:r>
+      <w:proofErr w:type="spellEnd"/>
+      <w:r>
+        <w:rPr>
+          <w:rFonts w:ascii="Times New Roman" w:eastAsia="Times New Roman" w:hAnsi="Times New Roman" w:cs="Times New Roman"/>
+          <w:color w:val="00000A"/>
+          <w:kern w:val="0"/>
+          <w:sz w:val="28"/>
+          <w:szCs w:val="28"/>
+          <w:lang w:eastAsia="ru-RU"/>
+          <w14:ligatures w14:val="none"/>
+        </w:rPr>
+        <w:t>, лист 1. Подставьте туда значения x (жидкость!) и y (пар!) – не перепутайте их местами.</w:t>
       </w:r>
     </w:p>
     <w:p>
@@ -1296,7 +1673,20 @@
           <w14:ligatures w14:val="none"/>
         </w:rPr>
         <w:lastRenderedPageBreak/>
-        <w:t>Найдите с помощью Подбора параметра или Поиска решения в Excel наилучшее значение k</w:t>
+        <w:t xml:space="preserve">Найдите с помощью Подбора параметра или Поиска решения в Excel наилучшее значение </w:t>
+      </w:r>
+      <w:proofErr w:type="spellStart"/>
+      <w:r>
+        <w:rPr>
+          <w:rFonts w:ascii="Times New Roman" w:eastAsia="Times New Roman" w:hAnsi="Times New Roman" w:cs="Times New Roman"/>
+          <w:color w:val="00000A"/>
+          <w:kern w:val="0"/>
+          <w:sz w:val="28"/>
+          <w:szCs w:val="28"/>
+          <w:lang w:eastAsia="ru-RU"/>
+          <w14:ligatures w14:val="none"/>
+        </w:rPr>
+        <w:t>k</w:t>
       </w:r>
       <w:r>
         <w:rPr>
@@ -1311,6 +1701,7 @@
         </w:rPr>
         <w:t>ij</w:t>
       </w:r>
+      <w:proofErr w:type="spellEnd"/>
       <w:r>
         <w:rPr>
           <w:rFonts w:ascii="Times New Roman" w:eastAsia="Times New Roman" w:hAnsi="Times New Roman" w:cs="Times New Roman"/>
@@ -1352,7 +1743,20 @@
           <w:lang w:eastAsia="ru-RU"/>
           <w14:ligatures w14:val="none"/>
         </w:rPr>
-        <w:t>Подставьте это значение k</w:t>
+        <w:t xml:space="preserve">Подставьте это значение </w:t>
+      </w:r>
+      <w:proofErr w:type="spellStart"/>
+      <w:r>
+        <w:rPr>
+          <w:rFonts w:ascii="Times New Roman" w:eastAsia="Times New Roman" w:hAnsi="Times New Roman" w:cs="Times New Roman"/>
+          <w:color w:val="00000A"/>
+          <w:kern w:val="0"/>
+          <w:sz w:val="28"/>
+          <w:szCs w:val="28"/>
+          <w:lang w:eastAsia="ru-RU"/>
+          <w14:ligatures w14:val="none"/>
+        </w:rPr>
+        <w:t>k</w:t>
       </w:r>
       <w:r>
         <w:rPr>
@@ -1367,6 +1771,7 @@
         </w:rPr>
         <w:t>ij</w:t>
       </w:r>
+      <w:proofErr w:type="spellEnd"/>
       <w:r>
         <w:rPr>
           <w:rFonts w:ascii="Times New Roman" w:eastAsia="Times New Roman" w:hAnsi="Times New Roman" w:cs="Times New Roman"/>
@@ -1434,7 +1839,262 @@
           <w:lang w:eastAsia="ru-RU"/>
           <w14:ligatures w14:val="none"/>
         </w:rPr>
-        <w:t>Повторите пп. 1-5 из части I.</w:t>
+        <w:t xml:space="preserve">Повторите </w:t>
+      </w:r>
+      <w:proofErr w:type="spellStart"/>
+      <w:r>
+        <w:rPr>
+          <w:rFonts w:ascii="Times New Roman" w:eastAsia="Times New Roman" w:hAnsi="Times New Roman" w:cs="Times New Roman"/>
+          <w:color w:val="00000A"/>
+          <w:kern w:val="0"/>
+          <w:sz w:val="28"/>
+          <w:szCs w:val="28"/>
+          <w:lang w:eastAsia="ru-RU"/>
+          <w14:ligatures w14:val="none"/>
+        </w:rPr>
+        <w:t>пп</w:t>
+      </w:r>
+      <w:proofErr w:type="spellEnd"/>
+      <w:r>
+        <w:rPr>
+          <w:rFonts w:ascii="Times New Roman" w:eastAsia="Times New Roman" w:hAnsi="Times New Roman" w:cs="Times New Roman"/>
+          <w:color w:val="00000A"/>
+          <w:kern w:val="0"/>
+          <w:sz w:val="28"/>
+          <w:szCs w:val="28"/>
+          <w:lang w:eastAsia="ru-RU"/>
+          <w14:ligatures w14:val="none"/>
+        </w:rPr>
+        <w:t xml:space="preserve">. </w:t>
+      </w:r>
+      <w:proofErr w:type="gramStart"/>
+      <w:r>
+        <w:rPr>
+          <w:rFonts w:ascii="Times New Roman" w:eastAsia="Times New Roman" w:hAnsi="Times New Roman" w:cs="Times New Roman"/>
+          <w:color w:val="00000A"/>
+          <w:kern w:val="0"/>
+          <w:sz w:val="28"/>
+          <w:szCs w:val="28"/>
+          <w:lang w:eastAsia="ru-RU"/>
+          <w14:ligatures w14:val="none"/>
+        </w:rPr>
+        <w:t>1-5</w:t>
+      </w:r>
+      <w:proofErr w:type="gramEnd"/>
+      <w:r>
+        <w:rPr>
+          <w:rFonts w:ascii="Times New Roman" w:eastAsia="Times New Roman" w:hAnsi="Times New Roman" w:cs="Times New Roman"/>
+          <w:color w:val="00000A"/>
+          <w:kern w:val="0"/>
+          <w:sz w:val="28"/>
+          <w:szCs w:val="28"/>
+          <w:lang w:eastAsia="ru-RU"/>
+          <w14:ligatures w14:val="none"/>
+        </w:rPr>
+        <w:t xml:space="preserve"> из части I.</w:t>
+      </w:r>
+    </w:p>
+    <w:p>
+      <w:pPr>
+        <w:suppressAutoHyphens/>
+        <w:spacing w:after="200" w:line="240" w:lineRule="auto"/>
+        <w:rPr>
+          <w:rFonts w:ascii="Times New Roman" w:eastAsia="Times New Roman" w:hAnsi="Times New Roman" w:cs="Times New Roman"/>
+          <w:color w:val="00000A"/>
+          <w:kern w:val="0"/>
+          <w:sz w:val="28"/>
+          <w:szCs w:val="28"/>
+          <w:lang w:eastAsia="ru-RU"/>
+          <w14:ligatures w14:val="none"/>
+        </w:rPr>
+      </w:pPr>
+    </w:p>
+    <w:p>
+      <w:pPr>
+        <w:rPr>
+          <w:rFonts w:ascii="Times New Roman" w:eastAsia="Times New Roman" w:hAnsi="Times New Roman" w:cs="Times New Roman"/>
+          <w:color w:val="00000A"/>
+          <w:kern w:val="0"/>
+          <w:sz w:val="28"/>
+          <w:szCs w:val="28"/>
+          <w:lang w:eastAsia="ru-RU"/>
+          <w14:ligatures w14:val="none"/>
+        </w:rPr>
+      </w:pPr>
+      <w:r>
+        <w:rPr>
+          <w:rFonts w:ascii="Times New Roman" w:eastAsia="Times New Roman" w:hAnsi="Times New Roman" w:cs="Times New Roman"/>
+          <w:color w:val="00000A"/>
+          <w:kern w:val="0"/>
+          <w:sz w:val="28"/>
+          <w:szCs w:val="28"/>
+          <w:lang w:eastAsia="ru-RU"/>
+          <w14:ligatures w14:val="none"/>
+        </w:rPr>
+        <w:br w:type="page"/>
+      </w:r>
+    </w:p>
+    <w:p>
+      <w:pPr>
+        <w:suppressAutoHyphens/>
+        <w:spacing w:after="200" w:line="240" w:lineRule="auto"/>
+        <w:jc w:val="center"/>
+        <w:rPr>
+          <w:rFonts w:ascii="Times New Roman" w:eastAsia="Times New Roman" w:hAnsi="Times New Roman" w:cs="Times New Roman"/>
+          <w:color w:val="00000A"/>
+          <w:kern w:val="0"/>
+          <w:sz w:val="28"/>
+          <w:szCs w:val="28"/>
+          <w:lang w:eastAsia="ru-RU"/>
+          <w14:ligatures w14:val="none"/>
+        </w:rPr>
+      </w:pPr>
+      <w:r>
+        <w:rPr>
+          <w:rFonts w:ascii="Times New Roman" w:eastAsia="Times New Roman" w:hAnsi="Times New Roman" w:cs="Times New Roman"/>
+          <w:color w:val="00000A"/>
+          <w:kern w:val="0"/>
+          <w:sz w:val="28"/>
+          <w:szCs w:val="28"/>
+          <w:lang w:eastAsia="ru-RU"/>
+          <w14:ligatures w14:val="none"/>
+        </w:rPr>
+        <w:lastRenderedPageBreak/>
+        <w:t>Решение</w:t>
+      </w:r>
+    </w:p>
+    <w:p>
+      <w:pPr>
+        <w:suppressAutoHyphens/>
+        <w:spacing w:after="200" w:line="240" w:lineRule="auto"/>
+        <w:jc w:val="center"/>
+        <w:rPr>
+          <w:rFonts w:ascii="Times New Roman" w:eastAsia="Times New Roman" w:hAnsi="Times New Roman" w:cs="Times New Roman"/>
+          <w:color w:val="00000A"/>
+          <w:kern w:val="0"/>
+          <w:sz w:val="28"/>
+          <w:szCs w:val="28"/>
+          <w:lang w:eastAsia="ru-RU"/>
+          <w14:ligatures w14:val="none"/>
+        </w:rPr>
+      </w:pPr>
+      <w:r>
+        <w:rPr>
+          <w:rFonts w:ascii="Times New Roman" w:eastAsia="Times New Roman" w:hAnsi="Times New Roman" w:cs="Times New Roman"/>
+          <w:color w:val="00000A"/>
+          <w:kern w:val="0"/>
+          <w:sz w:val="28"/>
+          <w:szCs w:val="28"/>
+          <w:lang w:eastAsia="ru-RU"/>
+          <w14:ligatures w14:val="none"/>
+        </w:rPr>
+        <w:t>1</w:t>
+      </w:r>
+    </w:p>
+    <w:p>
+      <w:pPr>
+        <w:suppressAutoHyphens/>
+        <w:spacing w:after="200" w:line="240" w:lineRule="auto"/>
+        <w:jc w:val="center"/>
+        <w:rPr>
+          <w:rFonts w:ascii="Times New Roman" w:eastAsia="Times New Roman" w:hAnsi="Times New Roman" w:cs="Times New Roman"/>
+          <w:color w:val="00000A"/>
+          <w:kern w:val="0"/>
+          <w:sz w:val="28"/>
+          <w:szCs w:val="28"/>
+          <w:lang w:eastAsia="ru-RU"/>
+          <w14:ligatures w14:val="none"/>
+        </w:rPr>
+      </w:pPr>
+      <w:r>
+        <w:drawing>
+          <wp:inline distT="0" distB="0" distL="0" distR="0" wp14:anchorId="65BCF0DF" wp14:editId="144B313C">
+            <wp:extent cx="4668168" cy="3676650"/>
+            <wp:effectExtent l="0" t="0" r="0" b="0"/>
+            <wp:docPr id="568616973" name="Рисунок 1"/>
+            <wp:cNvGraphicFramePr>
+              <a:graphicFrameLocks xmlns:a="http://schemas.openxmlformats.org/drawingml/2006/main" noChangeAspect="1"/>
+            </wp:cNvGraphicFramePr>
+            <a:graphic xmlns:a="http://schemas.openxmlformats.org/drawingml/2006/main">
+              <a:graphicData uri="http://schemas.openxmlformats.org/drawingml/2006/picture">
+                <pic:pic xmlns:pic="http://schemas.openxmlformats.org/drawingml/2006/picture">
+                  <pic:nvPicPr>
+                    <pic:cNvPr id="568616973" name=""/>
+                    <pic:cNvPicPr/>
+                  </pic:nvPicPr>
+                  <pic:blipFill>
+                    <a:blip r:embed="rId5"/>
+                    <a:stretch>
+                      <a:fillRect/>
+                    </a:stretch>
+                  </pic:blipFill>
+                  <pic:spPr>
+                    <a:xfrm>
+                      <a:off x="0" y="0"/>
+                      <a:ext cx="4670999" cy="3678880"/>
+                    </a:xfrm>
+                    <a:prstGeom prst="rect">
+                      <a:avLst/>
+                    </a:prstGeom>
+                  </pic:spPr>
+                </pic:pic>
+              </a:graphicData>
+            </a:graphic>
+          </wp:inline>
+        </w:drawing>
+      </w:r>
+    </w:p>
+    <w:p>
+      <w:pPr>
+        <w:suppressAutoHyphens/>
+        <w:spacing w:after="200" w:line="240" w:lineRule="auto"/>
+        <w:jc w:val="center"/>
+        <w:rPr>
+          <w:rFonts w:ascii="Times New Roman" w:eastAsia="Times New Roman" w:hAnsi="Times New Roman" w:cs="Times New Roman"/>
+          <w:color w:val="00000A"/>
+          <w:kern w:val="0"/>
+          <w:sz w:val="28"/>
+          <w:szCs w:val="28"/>
+          <w:lang w:eastAsia="ru-RU"/>
+          <w14:ligatures w14:val="none"/>
+        </w:rPr>
+      </w:pPr>
+      <w:r>
+        <w:drawing>
+          <wp:inline distT="0" distB="0" distL="0" distR="0" wp14:anchorId="3111A8C7" wp14:editId="55640B60">
+            <wp:extent cx="4653105" cy="3686175"/>
+            <wp:effectExtent l="0" t="0" r="0" b="0"/>
+            <wp:docPr id="189315004" name="Рисунок 1"/>
+            <wp:cNvGraphicFramePr>
+              <a:graphicFrameLocks xmlns:a="http://schemas.openxmlformats.org/drawingml/2006/main" noChangeAspect="1"/>
+            </wp:cNvGraphicFramePr>
+            <a:graphic xmlns:a="http://schemas.openxmlformats.org/drawingml/2006/main">
+              <a:graphicData uri="http://schemas.openxmlformats.org/drawingml/2006/picture">
+                <pic:pic xmlns:pic="http://schemas.openxmlformats.org/drawingml/2006/picture">
+                  <pic:nvPicPr>
+                    <pic:cNvPr id="189315004" name=""/>
+                    <pic:cNvPicPr/>
+                  </pic:nvPicPr>
+                  <pic:blipFill>
+                    <a:blip r:embed="rId6"/>
+                    <a:stretch>
+                      <a:fillRect/>
+                    </a:stretch>
+                  </pic:blipFill>
+                  <pic:spPr>
+                    <a:xfrm>
+                      <a:off x="0" y="0"/>
+                      <a:ext cx="4659776" cy="3691459"/>
+                    </a:xfrm>
+                    <a:prstGeom prst="rect">
+                      <a:avLst/>
+                    </a:prstGeom>
+                  </pic:spPr>
+                </pic:pic>
+              </a:graphicData>
+            </a:graphic>
+          </wp:inline>
+        </w:drawing>
       </w:r>
     </w:p>
     <w:bookmarkEnd w:id="15"/>
@@ -1451,23 +2111,17 @@
     <w:bookmarkEnd w:id="26"/>
     <w:bookmarkEnd w:id="27"/>
     <w:bookmarkEnd w:id="28"/>
-    <w:p/>
-    <w:p>
-      <w:pPr>
-        <w:rPr>
-          <w:lang w:val="en-US"/>
-        </w:rPr>
-      </w:pPr>
-      <w:r>
-        <w:rPr>
-          <w:noProof/>
-        </w:rPr>
+    <w:p>
+      <w:pPr>
+        <w:jc w:val="center"/>
+      </w:pPr>
+      <w:r>
         <w:lastRenderedPageBreak/>
         <w:drawing>
-          <wp:inline distT="0" distB="0" distL="0" distR="0" wp14:anchorId="67D44BD7" wp14:editId="6883E1FC">
-            <wp:extent cx="5848985" cy="4382770"/>
-            <wp:effectExtent l="0" t="0" r="0" b="0"/>
-            <wp:docPr id="904222181" name="Рисунок 7"/>
+          <wp:inline distT="0" distB="0" distL="0" distR="0" wp14:anchorId="67DD22EC" wp14:editId="5B9E530F">
+            <wp:extent cx="5115232" cy="4038600"/>
+            <wp:effectExtent l="0" t="0" r="9525" b="0"/>
+            <wp:docPr id="947644091" name="Рисунок 1"/>
             <wp:cNvGraphicFramePr>
               <a:graphicFrameLocks xmlns:a="http://schemas.openxmlformats.org/drawingml/2006/main" noChangeAspect="1"/>
             </wp:cNvGraphicFramePr>
@@ -1475,36 +2129,23 @@
               <a:graphicData uri="http://schemas.openxmlformats.org/drawingml/2006/picture">
                 <pic:pic xmlns:pic="http://schemas.openxmlformats.org/drawingml/2006/picture">
                   <pic:nvPicPr>
-                    <pic:cNvPr id="0" name="Picture 7"/>
-                    <pic:cNvPicPr>
-                      <a:picLocks noChangeAspect="1" noChangeArrowheads="1"/>
-                    </pic:cNvPicPr>
+                    <pic:cNvPr id="947644091" name=""/>
+                    <pic:cNvPicPr/>
                   </pic:nvPicPr>
                   <pic:blipFill>
-                    <a:blip r:embed="rId5">
-                      <a:extLst>
-                        <a:ext uri="{28A0092B-C50C-407E-A947-70E740481C1C}">
-                          <a14:useLocalDpi xmlns:a14="http://schemas.microsoft.com/office/drawing/2010/main" val="0"/>
-                        </a:ext>
-                      </a:extLst>
-                    </a:blip>
-                    <a:srcRect/>
+                    <a:blip r:embed="rId7"/>
                     <a:stretch>
                       <a:fillRect/>
                     </a:stretch>
                   </pic:blipFill>
-                  <pic:spPr bwMode="auto">
+                  <pic:spPr>
                     <a:xfrm>
                       <a:off x="0" y="0"/>
-                      <a:ext cx="5848985" cy="4382770"/>
+                      <a:ext cx="5118750" cy="4041378"/>
                     </a:xfrm>
                     <a:prstGeom prst="rect">
                       <a:avLst/>
                     </a:prstGeom>
-                    <a:noFill/>
-                    <a:ln>
-                      <a:noFill/>
-                    </a:ln>
                   </pic:spPr>
                 </pic:pic>
               </a:graphicData>
@@ -1512,16 +2153,32 @@
           </wp:inline>
         </w:drawing>
       </w:r>
-      <w:r>
-        <w:rPr>
-          <w:noProof/>
-          <w:lang w:val="en-US"/>
-        </w:rPr>
+    </w:p>
+    <w:p>
+      <w:r>
+        <w:br w:type="page"/>
+      </w:r>
+    </w:p>
+    <w:p>
+      <w:pPr>
+        <w:jc w:val="center"/>
+      </w:pPr>
+      <w:r>
+        <w:lastRenderedPageBreak/>
+        <w:t>2</w:t>
+      </w:r>
+    </w:p>
+    <w:p/>
+    <w:p>
+      <w:pPr>
+        <w:jc w:val="center"/>
+      </w:pPr>
+      <w:r>
         <w:drawing>
-          <wp:inline distT="0" distB="0" distL="0" distR="0" wp14:anchorId="738C2984" wp14:editId="5C40BEE5">
-            <wp:extent cx="5848985" cy="4382770"/>
-            <wp:effectExtent l="0" t="0" r="0" b="0"/>
-            <wp:docPr id="628259420" name="Рисунок 8"/>
+          <wp:inline distT="0" distB="0" distL="0" distR="0" wp14:anchorId="2E4E0E01" wp14:editId="02127040">
+            <wp:extent cx="5041070" cy="3790950"/>
+            <wp:effectExtent l="0" t="0" r="7620" b="0"/>
+            <wp:docPr id="826290110" name="Рисунок 1"/>
             <wp:cNvGraphicFramePr>
               <a:graphicFrameLocks xmlns:a="http://schemas.openxmlformats.org/drawingml/2006/main" noChangeAspect="1"/>
             </wp:cNvGraphicFramePr>
@@ -1529,36 +2186,23 @@
               <a:graphicData uri="http://schemas.openxmlformats.org/drawingml/2006/picture">
                 <pic:pic xmlns:pic="http://schemas.openxmlformats.org/drawingml/2006/picture">
                   <pic:nvPicPr>
-                    <pic:cNvPr id="0" name="Picture 8"/>
-                    <pic:cNvPicPr>
-                      <a:picLocks noChangeAspect="1" noChangeArrowheads="1"/>
-                    </pic:cNvPicPr>
+                    <pic:cNvPr id="826290110" name=""/>
+                    <pic:cNvPicPr/>
                   </pic:nvPicPr>
                   <pic:blipFill>
-                    <a:blip r:embed="rId6">
-                      <a:extLst>
-                        <a:ext uri="{28A0092B-C50C-407E-A947-70E740481C1C}">
-                          <a14:useLocalDpi xmlns:a14="http://schemas.microsoft.com/office/drawing/2010/main" val="0"/>
-                        </a:ext>
-                      </a:extLst>
-                    </a:blip>
-                    <a:srcRect/>
+                    <a:blip r:embed="rId8"/>
                     <a:stretch>
                       <a:fillRect/>
                     </a:stretch>
                   </pic:blipFill>
-                  <pic:spPr bwMode="auto">
+                  <pic:spPr>
                     <a:xfrm>
                       <a:off x="0" y="0"/>
-                      <a:ext cx="5848985" cy="4382770"/>
+                      <a:ext cx="5048794" cy="3796758"/>
                     </a:xfrm>
                     <a:prstGeom prst="rect">
                       <a:avLst/>
                     </a:prstGeom>
-                    <a:noFill/>
-                    <a:ln>
-                      <a:noFill/>
-                    </a:ln>
                   </pic:spPr>
                 </pic:pic>
               </a:graphicData>
@@ -1566,17 +2210,22 @@
           </wp:inline>
         </w:drawing>
       </w:r>
-      <w:r>
-        <w:rPr>
-          <w:noProof/>
-          <w:lang w:val="en-US"/>
-        </w:rPr>
-        <w:lastRenderedPageBreak/>
+    </w:p>
+    <w:p>
+      <w:pPr>
+        <w:jc w:val="center"/>
+      </w:pPr>
+    </w:p>
+    <w:p>
+      <w:pPr>
+        <w:jc w:val="center"/>
+      </w:pPr>
+      <w:r>
         <w:drawing>
-          <wp:inline distT="0" distB="0" distL="0" distR="0" wp14:anchorId="5CAF1CDC" wp14:editId="51FABF8F">
-            <wp:extent cx="5848985" cy="4382770"/>
-            <wp:effectExtent l="0" t="0" r="0" b="0"/>
-            <wp:docPr id="991889905" name="Рисунок 9"/>
+          <wp:inline distT="0" distB="0" distL="0" distR="0" wp14:anchorId="15ED15B5" wp14:editId="43053D87">
+            <wp:extent cx="5121275" cy="3765820"/>
+            <wp:effectExtent l="0" t="0" r="3175" b="6350"/>
+            <wp:docPr id="1980456889" name="Рисунок 1"/>
             <wp:cNvGraphicFramePr>
               <a:graphicFrameLocks xmlns:a="http://schemas.openxmlformats.org/drawingml/2006/main" noChangeAspect="1"/>
             </wp:cNvGraphicFramePr>
@@ -1584,36 +2233,23 @@
               <a:graphicData uri="http://schemas.openxmlformats.org/drawingml/2006/picture">
                 <pic:pic xmlns:pic="http://schemas.openxmlformats.org/drawingml/2006/picture">
                   <pic:nvPicPr>
-                    <pic:cNvPr id="0" name="Picture 9"/>
-                    <pic:cNvPicPr>
-                      <a:picLocks noChangeAspect="1" noChangeArrowheads="1"/>
-                    </pic:cNvPicPr>
+                    <pic:cNvPr id="1980456889" name=""/>
+                    <pic:cNvPicPr/>
                   </pic:nvPicPr>
                   <pic:blipFill>
-                    <a:blip r:embed="rId7">
-                      <a:extLst>
-                        <a:ext uri="{28A0092B-C50C-407E-A947-70E740481C1C}">
-                          <a14:useLocalDpi xmlns:a14="http://schemas.microsoft.com/office/drawing/2010/main" val="0"/>
-                        </a:ext>
-                      </a:extLst>
-                    </a:blip>
-                    <a:srcRect/>
+                    <a:blip r:embed="rId9"/>
                     <a:stretch>
                       <a:fillRect/>
                     </a:stretch>
                   </pic:blipFill>
-                  <pic:spPr bwMode="auto">
+                  <pic:spPr>
                     <a:xfrm>
                       <a:off x="0" y="0"/>
-                      <a:ext cx="5848985" cy="4382770"/>
+                      <a:ext cx="5130715" cy="3772761"/>
                     </a:xfrm>
                     <a:prstGeom prst="rect">
                       <a:avLst/>
                     </a:prstGeom>
-                    <a:noFill/>
-                    <a:ln>
-                      <a:noFill/>
-                    </a:ln>
                   </pic:spPr>
                 </pic:pic>
               </a:graphicData>
@@ -1621,16 +2257,23 @@
           </wp:inline>
         </w:drawing>
       </w:r>
-      <w:r>
-        <w:rPr>
-          <w:noProof/>
-          <w:lang w:val="en-US"/>
-        </w:rPr>
+    </w:p>
+    <w:p>
+      <w:r>
+        <w:br w:type="page"/>
+      </w:r>
+    </w:p>
+    <w:p>
+      <w:pPr>
+        <w:jc w:val="center"/>
+      </w:pPr>
+      <w:r>
+        <w:lastRenderedPageBreak/>
         <w:drawing>
-          <wp:inline distT="0" distB="0" distL="0" distR="0" wp14:anchorId="56176A4D" wp14:editId="02840A7E">
-            <wp:extent cx="5848985" cy="4382770"/>
+          <wp:inline distT="0" distB="0" distL="0" distR="0" wp14:anchorId="042283D5" wp14:editId="0CAC0C33">
+            <wp:extent cx="5048250" cy="3755294"/>
             <wp:effectExtent l="0" t="0" r="0" b="0"/>
-            <wp:docPr id="1342090109" name="Рисунок 10"/>
+            <wp:docPr id="1222904046" name="Рисунок 1"/>
             <wp:cNvGraphicFramePr>
               <a:graphicFrameLocks xmlns:a="http://schemas.openxmlformats.org/drawingml/2006/main" noChangeAspect="1"/>
             </wp:cNvGraphicFramePr>
@@ -1638,145 +2281,23 @@
               <a:graphicData uri="http://schemas.openxmlformats.org/drawingml/2006/picture">
                 <pic:pic xmlns:pic="http://schemas.openxmlformats.org/drawingml/2006/picture">
                   <pic:nvPicPr>
-                    <pic:cNvPr id="0" name="Picture 10"/>
-                    <pic:cNvPicPr>
-                      <a:picLocks noChangeAspect="1" noChangeArrowheads="1"/>
-                    </pic:cNvPicPr>
+                    <pic:cNvPr id="1222904046" name=""/>
+                    <pic:cNvPicPr/>
                   </pic:nvPicPr>
                   <pic:blipFill>
-                    <a:blip r:embed="rId8">
-                      <a:extLst>
-                        <a:ext uri="{28A0092B-C50C-407E-A947-70E740481C1C}">
-                          <a14:useLocalDpi xmlns:a14="http://schemas.microsoft.com/office/drawing/2010/main" val="0"/>
-                        </a:ext>
-                      </a:extLst>
-                    </a:blip>
-                    <a:srcRect/>
+                    <a:blip r:embed="rId10"/>
                     <a:stretch>
                       <a:fillRect/>
                     </a:stretch>
                   </pic:blipFill>
-                  <pic:spPr bwMode="auto">
+                  <pic:spPr>
                     <a:xfrm>
                       <a:off x="0" y="0"/>
-                      <a:ext cx="5848985" cy="4382770"/>
+                      <a:ext cx="5050947" cy="3757300"/>
                     </a:xfrm>
                     <a:prstGeom prst="rect">
                       <a:avLst/>
                     </a:prstGeom>
-                    <a:noFill/>
-                    <a:ln>
-                      <a:noFill/>
-                    </a:ln>
-                  </pic:spPr>
-                </pic:pic>
-              </a:graphicData>
-            </a:graphic>
-          </wp:inline>
-        </w:drawing>
-      </w:r>
-      <w:r>
-        <w:rPr>
-          <w:noProof/>
-          <w:lang w:val="en-US"/>
-        </w:rPr>
-        <w:lastRenderedPageBreak/>
-        <w:drawing>
-          <wp:inline distT="0" distB="0" distL="0" distR="0" wp14:anchorId="5ABA51F3" wp14:editId="5333647C">
-            <wp:extent cx="5848985" cy="4382770"/>
-            <wp:effectExtent l="0" t="0" r="0" b="0"/>
-            <wp:docPr id="1435303462" name="Рисунок 11"/>
-            <wp:cNvGraphicFramePr>
-              <a:graphicFrameLocks xmlns:a="http://schemas.openxmlformats.org/drawingml/2006/main" noChangeAspect="1"/>
-            </wp:cNvGraphicFramePr>
-            <a:graphic xmlns:a="http://schemas.openxmlformats.org/drawingml/2006/main">
-              <a:graphicData uri="http://schemas.openxmlformats.org/drawingml/2006/picture">
-                <pic:pic xmlns:pic="http://schemas.openxmlformats.org/drawingml/2006/picture">
-                  <pic:nvPicPr>
-                    <pic:cNvPr id="0" name="Picture 11"/>
-                    <pic:cNvPicPr>
-                      <a:picLocks noChangeAspect="1" noChangeArrowheads="1"/>
-                    </pic:cNvPicPr>
-                  </pic:nvPicPr>
-                  <pic:blipFill>
-                    <a:blip r:embed="rId9">
-                      <a:extLst>
-                        <a:ext uri="{28A0092B-C50C-407E-A947-70E740481C1C}">
-                          <a14:useLocalDpi xmlns:a14="http://schemas.microsoft.com/office/drawing/2010/main" val="0"/>
-                        </a:ext>
-                      </a:extLst>
-                    </a:blip>
-                    <a:srcRect/>
-                    <a:stretch>
-                      <a:fillRect/>
-                    </a:stretch>
-                  </pic:blipFill>
-                  <pic:spPr bwMode="auto">
-                    <a:xfrm>
-                      <a:off x="0" y="0"/>
-                      <a:ext cx="5848985" cy="4382770"/>
-                    </a:xfrm>
-                    <a:prstGeom prst="rect">
-                      <a:avLst/>
-                    </a:prstGeom>
-                    <a:noFill/>
-                    <a:ln>
-                      <a:noFill/>
-                    </a:ln>
-                  </pic:spPr>
-                </pic:pic>
-              </a:graphicData>
-            </a:graphic>
-          </wp:inline>
-        </w:drawing>
-      </w:r>
-      <w:r>
-        <w:rPr>
-          <w:noProof/>
-          <w:lang w:val="en-US"/>
-        </w:rPr>
-        <w:drawing>
-          <wp:inline distT="0" distB="0" distL="0" distR="0" wp14:anchorId="3A5A9B54" wp14:editId="4D907F5E">
-            <wp:extent cx="5943600" cy="3704590"/>
-            <wp:effectExtent l="0" t="0" r="0" b="0"/>
-            <wp:docPr id="395013669" name="Рисунок 12"/>
-            <wp:cNvGraphicFramePr>
-              <a:graphicFrameLocks xmlns:a="http://schemas.openxmlformats.org/drawingml/2006/main" noChangeAspect="1"/>
-            </wp:cNvGraphicFramePr>
-            <a:graphic xmlns:a="http://schemas.openxmlformats.org/drawingml/2006/main">
-              <a:graphicData uri="http://schemas.openxmlformats.org/drawingml/2006/picture">
-                <pic:pic xmlns:pic="http://schemas.openxmlformats.org/drawingml/2006/picture">
-                  <pic:nvPicPr>
-                    <pic:cNvPr id="0" name="Picture 12"/>
-                    <pic:cNvPicPr>
-                      <a:picLocks noChangeAspect="1" noChangeArrowheads="1"/>
-                    </pic:cNvPicPr>
-                  </pic:nvPicPr>
-                  <pic:blipFill>
-                    <a:blip r:embed="rId10">
-                      <a:extLst>
-                        <a:ext uri="{28A0092B-C50C-407E-A947-70E740481C1C}">
-                          <a14:useLocalDpi xmlns:a14="http://schemas.microsoft.com/office/drawing/2010/main" val="0"/>
-                        </a:ext>
-                      </a:extLst>
-                    </a:blip>
-                    <a:srcRect/>
-                    <a:stretch>
-                      <a:fillRect/>
-                    </a:stretch>
-                  </pic:blipFill>
-                  <pic:spPr bwMode="auto">
-                    <a:xfrm>
-                      <a:off x="0" y="0"/>
-                      <a:ext cx="5943600" cy="3704590"/>
-                    </a:xfrm>
-                    <a:prstGeom prst="rect">
-                      <a:avLst/>
-                    </a:prstGeom>
-                    <a:noFill/>
-                    <a:ln>
-                      <a:noFill/>
-                    </a:ln>
                   </pic:spPr>
                 </pic:pic>
               </a:graphicData>

</xml_diff>

<commit_message>
dm lab 5 and 6 refactor
</commit_message>
<xml_diff>
--- a/digital-modeling/5 Лаба/Отчет.docx
+++ b/digital-modeling/5 Лаба/Отчет.docx
@@ -61,35 +61,7 @@
           <w:lang w:eastAsia="ru-RU"/>
           <w14:ligatures w14:val="none"/>
         </w:rPr>
-        <w:t xml:space="preserve">Федеральное государственное бюджетное образовательное учреждение высшего образования «Российский химико-технологический университет имени </w:t>
-      </w:r>
-      <w:proofErr w:type="gramStart"/>
-      <w:r>
-        <w:rPr>
-          <w:rFonts w:ascii="Times New Roman" w:eastAsia="Times New Roman" w:hAnsi="Times New Roman" w:cs="Times New Roman"/>
-          <w:bCs/>
-          <w:color w:val="00000A"/>
-          <w:kern w:val="0"/>
-          <w:sz w:val="28"/>
-          <w:szCs w:val="22"/>
-          <w:lang w:eastAsia="ru-RU"/>
-          <w14:ligatures w14:val="none"/>
-        </w:rPr>
-        <w:t>Д.И.</w:t>
-      </w:r>
-      <w:proofErr w:type="gramEnd"/>
-      <w:r>
-        <w:rPr>
-          <w:rFonts w:ascii="Times New Roman" w:eastAsia="Times New Roman" w:hAnsi="Times New Roman" w:cs="Times New Roman"/>
-          <w:bCs/>
-          <w:color w:val="00000A"/>
-          <w:kern w:val="0"/>
-          <w:sz w:val="28"/>
-          <w:szCs w:val="22"/>
-          <w:lang w:eastAsia="ru-RU"/>
-          <w14:ligatures w14:val="none"/>
-        </w:rPr>
-        <w:t xml:space="preserve"> Менделеева»</w:t>
+        <w:t>Федеральное государственное бюджетное образовательное учреждение высшего образования «Российский химико-технологический университет имени Д.И. Менделеева»</w:t>
       </w:r>
     </w:p>
     <w:p>
@@ -344,7 +316,6 @@
         <w:t xml:space="preserve">) и анализ зависимости </w:t>
       </w:r>
       <w:proofErr w:type="spellStart"/>
-      <w:proofErr w:type="gramStart"/>
       <w:r>
         <w:rPr>
           <w:rFonts w:ascii="Times New Roman" w:eastAsia="Times New Roman" w:hAnsi="Times New Roman" w:cs="Times New Roman"/>
@@ -372,22 +343,7 @@
           <w:lang w:eastAsia="ru-RU"/>
           <w14:ligatures w14:val="none"/>
         </w:rPr>
-        <w:t>(</w:t>
-      </w:r>
-      <w:proofErr w:type="gramEnd"/>
-      <w:r>
-        <w:rPr>
-          <w:rFonts w:ascii="Times New Roman" w:eastAsia="Times New Roman" w:hAnsi="Times New Roman" w:cs="Times New Roman"/>
-          <w:b/>
-          <w:bCs/>
-          <w:color w:val="00000A"/>
-          <w:kern w:val="0"/>
-          <w:sz w:val="28"/>
-          <w:szCs w:val="28"/>
-          <w:lang w:eastAsia="ru-RU"/>
-          <w14:ligatures w14:val="none"/>
-        </w:rPr>
-        <w:t>T, P)»</w:t>
+        <w:t>(T, P)»</w:t>
       </w:r>
     </w:p>
     <w:p>
@@ -1452,33 +1408,7 @@
           <w:lang w:eastAsia="ru-RU"/>
           <w14:ligatures w14:val="none"/>
         </w:rPr>
-        <w:t xml:space="preserve">-Робинсона для газовой и </w:t>
-      </w:r>
-      <w:proofErr w:type="gramStart"/>
-      <w:r>
-        <w:rPr>
-          <w:rFonts w:ascii="Times New Roman" w:eastAsia="Times New Roman" w:hAnsi="Times New Roman" w:cs="Times New Roman"/>
-          <w:color w:val="00000A"/>
-          <w:kern w:val="0"/>
-          <w:sz w:val="28"/>
-          <w:szCs w:val="28"/>
-          <w:lang w:eastAsia="ru-RU"/>
-          <w14:ligatures w14:val="none"/>
-        </w:rPr>
-        <w:t>1-2</w:t>
-      </w:r>
-      <w:proofErr w:type="gramEnd"/>
-      <w:r>
-        <w:rPr>
-          <w:rFonts w:ascii="Times New Roman" w:eastAsia="Times New Roman" w:hAnsi="Times New Roman" w:cs="Times New Roman"/>
-          <w:color w:val="00000A"/>
-          <w:kern w:val="0"/>
-          <w:sz w:val="28"/>
-          <w:szCs w:val="28"/>
-          <w:lang w:eastAsia="ru-RU"/>
-          <w14:ligatures w14:val="none"/>
-        </w:rPr>
-        <w:t xml:space="preserve"> жидких фаз)</w:t>
+        <w:t>-Робинсона для газовой и 1-2 жидких фаз)</w:t>
       </w:r>
     </w:p>
     <w:p>
@@ -1865,33 +1795,7 @@
           <w:lang w:eastAsia="ru-RU"/>
           <w14:ligatures w14:val="none"/>
         </w:rPr>
-        <w:t xml:space="preserve">. </w:t>
-      </w:r>
-      <w:proofErr w:type="gramStart"/>
-      <w:r>
-        <w:rPr>
-          <w:rFonts w:ascii="Times New Roman" w:eastAsia="Times New Roman" w:hAnsi="Times New Roman" w:cs="Times New Roman"/>
-          <w:color w:val="00000A"/>
-          <w:kern w:val="0"/>
-          <w:sz w:val="28"/>
-          <w:szCs w:val="28"/>
-          <w:lang w:eastAsia="ru-RU"/>
-          <w14:ligatures w14:val="none"/>
-        </w:rPr>
-        <w:t>1-5</w:t>
-      </w:r>
-      <w:proofErr w:type="gramEnd"/>
-      <w:r>
-        <w:rPr>
-          <w:rFonts w:ascii="Times New Roman" w:eastAsia="Times New Roman" w:hAnsi="Times New Roman" w:cs="Times New Roman"/>
-          <w:color w:val="00000A"/>
-          <w:kern w:val="0"/>
-          <w:sz w:val="28"/>
-          <w:szCs w:val="28"/>
-          <w:lang w:eastAsia="ru-RU"/>
-          <w14:ligatures w14:val="none"/>
-        </w:rPr>
-        <w:t xml:space="preserve"> из части I.</w:t>
+        <w:t>. 1-5 из части I.</w:t>
       </w:r>
     </w:p>
     <w:p>
@@ -2007,6 +1911,9 @@
         </w:rPr>
       </w:pPr>
       <w:r>
+        <w:rPr>
+          <w:noProof/>
+        </w:rPr>
         <w:drawing>
           <wp:inline distT="0" distB="0" distL="0" distR="0" wp14:anchorId="65BCF0DF" wp14:editId="144B313C">
             <wp:extent cx="4668168" cy="3676650"/>
@@ -2060,6 +1967,9 @@
         </w:rPr>
       </w:pPr>
       <w:r>
+        <w:rPr>
+          <w:noProof/>
+        </w:rPr>
         <w:drawing>
           <wp:inline distT="0" distB="0" distL="0" distR="0" wp14:anchorId="3111A8C7" wp14:editId="55640B60">
             <wp:extent cx="4653105" cy="3686175"/>
@@ -2114,8 +2024,14 @@
     <w:p>
       <w:pPr>
         <w:jc w:val="center"/>
-      </w:pPr>
-      <w:r>
+        <w:rPr>
+          <w:lang w:val="en-US"/>
+        </w:rPr>
+      </w:pPr>
+      <w:r>
+        <w:rPr>
+          <w:noProof/>
+        </w:rPr>
         <w:lastRenderedPageBreak/>
         <w:drawing>
           <wp:inline distT="0" distB="0" distL="0" distR="0" wp14:anchorId="67DD22EC" wp14:editId="5B9E530F">
@@ -2156,6 +2072,561 @@
     </w:p>
     <w:p>
       <w:r>
+        <w:t>Точка D для z = 0.5 в середине по температуре:</w:t>
+      </w:r>
+    </w:p>
+    <w:p>
+      <w:pPr>
+        <w:rPr>
+          <w:lang w:val="en-US"/>
+        </w:rPr>
+      </w:pPr>
+      <w:r>
+        <w:t xml:space="preserve">  </w:t>
+      </w:r>
+      <w:proofErr w:type="spellStart"/>
+      <w:r>
+        <w:rPr>
+          <w:lang w:val="en-US"/>
+        </w:rPr>
+        <w:t>T_bubble</w:t>
+      </w:r>
+      <w:proofErr w:type="spellEnd"/>
+      <w:r>
+        <w:rPr>
+          <w:lang w:val="en-US"/>
+        </w:rPr>
+        <w:t xml:space="preserve"> = 326.762 K</w:t>
+      </w:r>
+    </w:p>
+    <w:p>
+      <w:pPr>
+        <w:rPr>
+          <w:lang w:val="en-US"/>
+        </w:rPr>
+      </w:pPr>
+      <w:r>
+        <w:rPr>
+          <w:lang w:val="en-US"/>
+        </w:rPr>
+        <w:t xml:space="preserve">  </w:t>
+      </w:r>
+      <w:proofErr w:type="spellStart"/>
+      <w:r>
+        <w:rPr>
+          <w:lang w:val="en-US"/>
+        </w:rPr>
+        <w:t>T_dew</w:t>
+      </w:r>
+      <w:proofErr w:type="spellEnd"/>
+      <w:r>
+        <w:rPr>
+          <w:lang w:val="en-US"/>
+        </w:rPr>
+        <w:t xml:space="preserve">    = 331.828 K</w:t>
+      </w:r>
+    </w:p>
+    <w:p>
+      <w:pPr>
+        <w:rPr>
+          <w:lang w:val="en-US"/>
+        </w:rPr>
+      </w:pPr>
+      <w:r>
+        <w:rPr>
+          <w:lang w:val="en-US"/>
+        </w:rPr>
+        <w:t>  T = 329.295 K</w:t>
+      </w:r>
+    </w:p>
+    <w:p>
+      <w:pPr>
+        <w:rPr>
+          <w:lang w:val="en-US"/>
+        </w:rPr>
+      </w:pPr>
+      <w:r>
+        <w:rPr>
+          <w:lang w:val="en-US"/>
+        </w:rPr>
+        <w:t>  x1 = 0.92753</w:t>
+      </w:r>
+    </w:p>
+    <w:p>
+      <w:pPr>
+        <w:rPr>
+          <w:lang w:val="en-US"/>
+        </w:rPr>
+      </w:pPr>
+      <w:r>
+        <w:rPr>
+          <w:lang w:val="en-US"/>
+        </w:rPr>
+        <w:t>  y1 = 0.45323</w:t>
+      </w:r>
+    </w:p>
+    <w:p>
+      <w:pPr>
+        <w:rPr>
+          <w:lang w:val="en-US"/>
+        </w:rPr>
+      </w:pPr>
+      <w:r>
+        <w:rPr>
+          <w:lang w:val="en-US"/>
+        </w:rPr>
+        <w:t>  L = 0.0986</w:t>
+      </w:r>
+    </w:p>
+    <w:p>
+      <w:pPr>
+        <w:rPr>
+          <w:lang w:val="en-US"/>
+        </w:rPr>
+      </w:pPr>
+      <w:r>
+        <w:rPr>
+          <w:lang w:val="en-US"/>
+        </w:rPr>
+        <w:t>  V = 0.9014</w:t>
+      </w:r>
+    </w:p>
+    <w:p>
+      <w:pPr>
+        <w:rPr>
+          <w:lang w:val="en-US"/>
+        </w:rPr>
+      </w:pPr>
+      <w:r>
+        <w:t>Точка</w:t>
+      </w:r>
+      <w:r>
+        <w:rPr>
+          <w:lang w:val="en-US"/>
+        </w:rPr>
+        <w:t xml:space="preserve"> 1: T=337.355 K, z=0.00055, 1 </w:t>
+      </w:r>
+      <w:r>
+        <w:t>фаза</w:t>
+      </w:r>
+      <w:r>
+        <w:rPr>
+          <w:lang w:val="en-US"/>
+        </w:rPr>
+        <w:t xml:space="preserve">, </w:t>
+      </w:r>
+      <w:proofErr w:type="spellStart"/>
+      <w:r>
+        <w:rPr>
+          <w:lang w:val="en-US"/>
+        </w:rPr>
+        <w:t>x_calc</w:t>
+      </w:r>
+      <w:proofErr w:type="spellEnd"/>
+      <w:r>
+        <w:rPr>
+          <w:lang w:val="en-US"/>
+        </w:rPr>
+        <w:t xml:space="preserve">=0.00000, </w:t>
+      </w:r>
+      <w:proofErr w:type="spellStart"/>
+      <w:r>
+        <w:rPr>
+          <w:lang w:val="en-US"/>
+        </w:rPr>
+        <w:t>y_calc</w:t>
+      </w:r>
+      <w:proofErr w:type="spellEnd"/>
+      <w:r>
+        <w:rPr>
+          <w:lang w:val="en-US"/>
+        </w:rPr>
+        <w:t>=0.00055, |dx|=0.00010, |</w:t>
+      </w:r>
+      <w:proofErr w:type="spellStart"/>
+      <w:r>
+        <w:rPr>
+          <w:lang w:val="en-US"/>
+        </w:rPr>
+        <w:t>dy</w:t>
+      </w:r>
+      <w:proofErr w:type="spellEnd"/>
+      <w:r>
+        <w:rPr>
+          <w:lang w:val="en-US"/>
+        </w:rPr>
+        <w:t>|=0.00045</w:t>
+      </w:r>
+    </w:p>
+    <w:p>
+      <w:pPr>
+        <w:rPr>
+          <w:lang w:val="en-US"/>
+        </w:rPr>
+      </w:pPr>
+      <w:r>
+        <w:t>Точка</w:t>
+      </w:r>
+      <w:r>
+        <w:rPr>
+          <w:lang w:val="en-US"/>
+        </w:rPr>
+        <w:t xml:space="preserve"> 2: T=337.306 K, z=0.00200, 1 </w:t>
+      </w:r>
+      <w:r>
+        <w:t>фаза</w:t>
+      </w:r>
+      <w:r>
+        <w:rPr>
+          <w:lang w:val="en-US"/>
+        </w:rPr>
+        <w:t xml:space="preserve">, </w:t>
+      </w:r>
+      <w:proofErr w:type="spellStart"/>
+      <w:r>
+        <w:rPr>
+          <w:lang w:val="en-US"/>
+        </w:rPr>
+        <w:t>x_calc</w:t>
+      </w:r>
+      <w:proofErr w:type="spellEnd"/>
+      <w:r>
+        <w:rPr>
+          <w:lang w:val="en-US"/>
+        </w:rPr>
+        <w:t xml:space="preserve">=0.00000, </w:t>
+      </w:r>
+      <w:proofErr w:type="spellStart"/>
+      <w:r>
+        <w:rPr>
+          <w:lang w:val="en-US"/>
+        </w:rPr>
+        <w:t>y_calc</w:t>
+      </w:r>
+      <w:proofErr w:type="spellEnd"/>
+      <w:r>
+        <w:rPr>
+          <w:lang w:val="en-US"/>
+        </w:rPr>
+        <w:t>=0.00200, |dx|=0.00100, |</w:t>
+      </w:r>
+      <w:proofErr w:type="spellStart"/>
+      <w:r>
+        <w:rPr>
+          <w:lang w:val="en-US"/>
+        </w:rPr>
+        <w:t>dy</w:t>
+      </w:r>
+      <w:proofErr w:type="spellEnd"/>
+      <w:r>
+        <w:rPr>
+          <w:lang w:val="en-US"/>
+        </w:rPr>
+        <w:t>|=0.00100</w:t>
+      </w:r>
+    </w:p>
+    <w:p>
+      <w:pPr>
+        <w:rPr>
+          <w:lang w:val="en-US"/>
+        </w:rPr>
+      </w:pPr>
+      <w:r>
+        <w:t>Точка</w:t>
+      </w:r>
+      <w:r>
+        <w:rPr>
+          <w:lang w:val="en-US"/>
+        </w:rPr>
+        <w:t xml:space="preserve"> 3: T=336.866 K, z=0.01950, 1 </w:t>
+      </w:r>
+      <w:r>
+        <w:t>фаза</w:t>
+      </w:r>
+      <w:r>
+        <w:rPr>
+          <w:lang w:val="en-US"/>
+        </w:rPr>
+        <w:t xml:space="preserve">, </w:t>
+      </w:r>
+      <w:proofErr w:type="spellStart"/>
+      <w:r>
+        <w:rPr>
+          <w:lang w:val="en-US"/>
+        </w:rPr>
+        <w:t>x_calc</w:t>
+      </w:r>
+      <w:proofErr w:type="spellEnd"/>
+      <w:r>
+        <w:rPr>
+          <w:lang w:val="en-US"/>
+        </w:rPr>
+        <w:t xml:space="preserve">=0.00000, </w:t>
+      </w:r>
+      <w:proofErr w:type="spellStart"/>
+      <w:r>
+        <w:rPr>
+          <w:lang w:val="en-US"/>
+        </w:rPr>
+        <w:t>y_calc</w:t>
+      </w:r>
+      <w:proofErr w:type="spellEnd"/>
+      <w:r>
+        <w:rPr>
+          <w:lang w:val="en-US"/>
+        </w:rPr>
+        <w:t>=0.01950, |dx|=0.01000, |</w:t>
+      </w:r>
+      <w:proofErr w:type="spellStart"/>
+      <w:r>
+        <w:rPr>
+          <w:lang w:val="en-US"/>
+        </w:rPr>
+        <w:t>dy</w:t>
+      </w:r>
+      <w:proofErr w:type="spellEnd"/>
+      <w:r>
+        <w:rPr>
+          <w:lang w:val="en-US"/>
+        </w:rPr>
+        <w:t>|=0.00950</w:t>
+      </w:r>
+    </w:p>
+    <w:p>
+      <w:pPr>
+        <w:rPr>
+          <w:lang w:val="en-US"/>
+        </w:rPr>
+      </w:pPr>
+      <w:r>
+        <w:t>Точка</w:t>
+      </w:r>
+      <w:r>
+        <w:rPr>
+          <w:lang w:val="en-US"/>
+        </w:rPr>
+        <w:t xml:space="preserve"> 4: T=335.940 K, z=0.05650, 1 </w:t>
+      </w:r>
+      <w:r>
+        <w:t>фаза</w:t>
+      </w:r>
+      <w:r>
+        <w:rPr>
+          <w:lang w:val="en-US"/>
+        </w:rPr>
+        <w:t xml:space="preserve">, </w:t>
+      </w:r>
+      <w:proofErr w:type="spellStart"/>
+      <w:r>
+        <w:rPr>
+          <w:lang w:val="en-US"/>
+        </w:rPr>
+        <w:t>x_calc</w:t>
+      </w:r>
+      <w:proofErr w:type="spellEnd"/>
+      <w:r>
+        <w:rPr>
+          <w:lang w:val="en-US"/>
+        </w:rPr>
+        <w:t xml:space="preserve">=0.00000, </w:t>
+      </w:r>
+      <w:proofErr w:type="spellStart"/>
+      <w:r>
+        <w:rPr>
+          <w:lang w:val="en-US"/>
+        </w:rPr>
+        <w:t>y_calc</w:t>
+      </w:r>
+      <w:proofErr w:type="spellEnd"/>
+      <w:r>
+        <w:rPr>
+          <w:lang w:val="en-US"/>
+        </w:rPr>
+        <w:t>=0.05650, |dx|=0.03000, |</w:t>
+      </w:r>
+      <w:proofErr w:type="spellStart"/>
+      <w:r>
+        <w:rPr>
+          <w:lang w:val="en-US"/>
+        </w:rPr>
+        <w:t>dy</w:t>
+      </w:r>
+      <w:proofErr w:type="spellEnd"/>
+      <w:r>
+        <w:rPr>
+          <w:lang w:val="en-US"/>
+        </w:rPr>
+        <w:t>|=0.02650</w:t>
+      </w:r>
+    </w:p>
+    <w:p>
+      <w:pPr>
+        <w:rPr>
+          <w:lang w:val="en-US"/>
+        </w:rPr>
+      </w:pPr>
+      <w:r>
+        <w:t>Точка</w:t>
+      </w:r>
+      <w:r>
+        <w:rPr>
+          <w:lang w:val="en-US"/>
+        </w:rPr>
+        <w:t xml:space="preserve"> 5: T=334.678 K, z=0.10700, 1 </w:t>
+      </w:r>
+      <w:r>
+        <w:t>фаза</w:t>
+      </w:r>
+      <w:r>
+        <w:rPr>
+          <w:lang w:val="en-US"/>
+        </w:rPr>
+        <w:t xml:space="preserve">, </w:t>
+      </w:r>
+      <w:proofErr w:type="spellStart"/>
+      <w:r>
+        <w:rPr>
+          <w:lang w:val="en-US"/>
+        </w:rPr>
+        <w:t>x_calc</w:t>
+      </w:r>
+      <w:proofErr w:type="spellEnd"/>
+      <w:r>
+        <w:rPr>
+          <w:lang w:val="en-US"/>
+        </w:rPr>
+        <w:t xml:space="preserve">=0.00000, </w:t>
+      </w:r>
+      <w:proofErr w:type="spellStart"/>
+      <w:r>
+        <w:rPr>
+          <w:lang w:val="en-US"/>
+        </w:rPr>
+        <w:t>y_calc</w:t>
+      </w:r>
+      <w:proofErr w:type="spellEnd"/>
+      <w:r>
+        <w:rPr>
+          <w:lang w:val="en-US"/>
+        </w:rPr>
+        <w:t>=0.10700, |dx|=0.06000, |</w:t>
+      </w:r>
+      <w:proofErr w:type="spellStart"/>
+      <w:r>
+        <w:rPr>
+          <w:lang w:val="en-US"/>
+        </w:rPr>
+        <w:t>dy</w:t>
+      </w:r>
+      <w:proofErr w:type="spellEnd"/>
+      <w:r>
+        <w:rPr>
+          <w:lang w:val="en-US"/>
+        </w:rPr>
+        <w:t>|=0.04700</w:t>
+      </w:r>
+    </w:p>
+    <w:p>
+      <w:pPr>
+        <w:rPr>
+          <w:lang w:val="en-US"/>
+        </w:rPr>
+      </w:pPr>
+    </w:p>
+    <w:p>
+      <w:r>
+        <w:t>Средняя абсолютная ошибка:</w:t>
+      </w:r>
+    </w:p>
+    <w:p>
+      <w:r>
+        <w:t>По x (жидкость): 0.020220</w:t>
+      </w:r>
+    </w:p>
+    <w:p>
+      <w:r>
+        <w:t>По y (пар):      0.016890</w:t>
+      </w:r>
+    </w:p>
+    <w:p/>
+    <w:p>
+      <w:r>
+        <w:t>Итог по диаграммам:</w:t>
+      </w:r>
+    </w:p>
+    <w:p>
+      <w:r>
+        <w:t xml:space="preserve">1) y-x диаграмма построена для </w:t>
+      </w:r>
+      <w:proofErr w:type="spellStart"/>
+      <w:r>
+        <w:t>cyclohexane</w:t>
+      </w:r>
+      <w:proofErr w:type="spellEnd"/>
+      <w:r>
+        <w:t xml:space="preserve"> при T = 298.15 K.</w:t>
+      </w:r>
+    </w:p>
+    <w:p>
+      <w:r>
+        <w:t>2) P-x диаграмма построена при T = 298.15 K.</w:t>
+      </w:r>
+    </w:p>
+    <w:p>
+      <w:r>
+        <w:t>3) T-x диаграмма построена при P = 1 бар.</w:t>
+      </w:r>
+    </w:p>
+    <w:p>
+      <w:r>
+        <w:t xml:space="preserve">   Диаграмма кипения с минимумом температуры, </w:t>
+      </w:r>
+      <w:proofErr w:type="spellStart"/>
+      <w:r>
+        <w:t>x_аз</w:t>
+      </w:r>
+      <w:proofErr w:type="spellEnd"/>
+      <w:r>
+        <w:t xml:space="preserve"> = 0.400, </w:t>
+      </w:r>
+      <w:proofErr w:type="spellStart"/>
+      <w:r>
+        <w:t>T_аз</w:t>
+      </w:r>
+      <w:proofErr w:type="spellEnd"/>
+      <w:r>
+        <w:t xml:space="preserve"> = 326.76 K.</w:t>
+      </w:r>
+    </w:p>
+    <w:p>
+      <w:r>
+        <w:t xml:space="preserve">4) Точка D рассчитана в двухфазной области для z = 50:50 в середине по температуре между </w:t>
+      </w:r>
+      <w:proofErr w:type="spellStart"/>
+      <w:r>
+        <w:t>bubble</w:t>
+      </w:r>
+      <w:proofErr w:type="spellEnd"/>
+      <w:r>
+        <w:t xml:space="preserve"> и </w:t>
+      </w:r>
+      <w:proofErr w:type="spellStart"/>
+      <w:r>
+        <w:t>dew</w:t>
+      </w:r>
+      <w:proofErr w:type="spellEnd"/>
+      <w:r>
+        <w:t>.</w:t>
+      </w:r>
+    </w:p>
+    <w:p>
+      <w:r>
+        <w:t>5) MAE посчитана по пяти точкам с учётом однофазных результатов как нулевой второй фазы.</w:t>
+      </w:r>
+    </w:p>
+    <w:p/>
+    <w:p>
+      <w:r>
         <w:br w:type="page"/>
       </w:r>
     </w:p>
@@ -2168,17 +2639,21 @@
         <w:t>2</w:t>
       </w:r>
     </w:p>
-    <w:p/>
-    <w:p>
-      <w:pPr>
-        <w:jc w:val="center"/>
-      </w:pPr>
-      <w:r>
+    <w:p>
+      <w:pPr>
+        <w:rPr>
+          <w:lang w:val="en-US"/>
+        </w:rPr>
+      </w:pPr>
+      <w:r>
+        <w:rPr>
+          <w:lang w:val="en-US"/>
+        </w:rPr>
         <w:drawing>
-          <wp:inline distT="0" distB="0" distL="0" distR="0" wp14:anchorId="2E4E0E01" wp14:editId="02127040">
-            <wp:extent cx="5041070" cy="3790950"/>
-            <wp:effectExtent l="0" t="0" r="7620" b="0"/>
-            <wp:docPr id="826290110" name="Рисунок 1"/>
+          <wp:inline distT="0" distB="0" distL="0" distR="0" wp14:anchorId="21274F21" wp14:editId="2D9D41DB">
+            <wp:extent cx="5940425" cy="4443095"/>
+            <wp:effectExtent l="0" t="0" r="3175" b="0"/>
+            <wp:docPr id="850657166" name="Рисунок 1"/>
             <wp:cNvGraphicFramePr>
               <a:graphicFrameLocks xmlns:a="http://schemas.openxmlformats.org/drawingml/2006/main" noChangeAspect="1"/>
             </wp:cNvGraphicFramePr>
@@ -2186,7 +2661,7 @@
               <a:graphicData uri="http://schemas.openxmlformats.org/drawingml/2006/picture">
                 <pic:pic xmlns:pic="http://schemas.openxmlformats.org/drawingml/2006/picture">
                   <pic:nvPicPr>
-                    <pic:cNvPr id="826290110" name=""/>
+                    <pic:cNvPr id="850657166" name=""/>
                     <pic:cNvPicPr/>
                   </pic:nvPicPr>
                   <pic:blipFill>
@@ -2198,7 +2673,7 @@
                   <pic:spPr>
                     <a:xfrm>
                       <a:off x="0" y="0"/>
-                      <a:ext cx="5048794" cy="3796758"/>
+                      <a:ext cx="5940425" cy="4443095"/>
                     </a:xfrm>
                     <a:prstGeom prst="rect">
                       <a:avLst/>
@@ -2213,19 +2688,20 @@
     </w:p>
     <w:p>
       <w:pPr>
-        <w:jc w:val="center"/>
-      </w:pPr>
-    </w:p>
-    <w:p>
-      <w:pPr>
-        <w:jc w:val="center"/>
-      </w:pPr>
-      <w:r>
+        <w:rPr>
+          <w:lang w:val="en-US"/>
+        </w:rPr>
+      </w:pPr>
+      <w:r>
+        <w:rPr>
+          <w:lang w:val="en-US"/>
+        </w:rPr>
+        <w:lastRenderedPageBreak/>
         <w:drawing>
-          <wp:inline distT="0" distB="0" distL="0" distR="0" wp14:anchorId="15ED15B5" wp14:editId="43053D87">
-            <wp:extent cx="5121275" cy="3765820"/>
-            <wp:effectExtent l="0" t="0" r="3175" b="6350"/>
-            <wp:docPr id="1980456889" name="Рисунок 1"/>
+          <wp:inline distT="0" distB="0" distL="0" distR="0" wp14:anchorId="426AF304" wp14:editId="70BA6E49">
+            <wp:extent cx="5940425" cy="4374515"/>
+            <wp:effectExtent l="0" t="0" r="3175" b="6985"/>
+            <wp:docPr id="1437751622" name="Рисунок 1"/>
             <wp:cNvGraphicFramePr>
               <a:graphicFrameLocks xmlns:a="http://schemas.openxmlformats.org/drawingml/2006/main" noChangeAspect="1"/>
             </wp:cNvGraphicFramePr>
@@ -2233,7 +2709,7 @@
               <a:graphicData uri="http://schemas.openxmlformats.org/drawingml/2006/picture">
                 <pic:pic xmlns:pic="http://schemas.openxmlformats.org/drawingml/2006/picture">
                   <pic:nvPicPr>
-                    <pic:cNvPr id="1980456889" name=""/>
+                    <pic:cNvPr id="1437751622" name=""/>
                     <pic:cNvPicPr/>
                   </pic:nvPicPr>
                   <pic:blipFill>
@@ -2245,7 +2721,7 @@
                   <pic:spPr>
                     <a:xfrm>
                       <a:off x="0" y="0"/>
-                      <a:ext cx="5130715" cy="3772761"/>
+                      <a:ext cx="5940425" cy="4374515"/>
                     </a:xfrm>
                     <a:prstGeom prst="rect">
                       <a:avLst/>
@@ -2259,21 +2735,20 @@
       </w:r>
     </w:p>
     <w:p>
-      <w:r>
-        <w:br w:type="page"/>
-      </w:r>
-    </w:p>
-    <w:p>
-      <w:pPr>
-        <w:jc w:val="center"/>
-      </w:pPr>
-      <w:r>
-        <w:lastRenderedPageBreak/>
+      <w:pPr>
+        <w:rPr>
+          <w:lang w:val="en-US"/>
+        </w:rPr>
+      </w:pPr>
+      <w:r>
+        <w:rPr>
+          <w:lang w:val="en-US"/>
+        </w:rPr>
         <w:drawing>
-          <wp:inline distT="0" distB="0" distL="0" distR="0" wp14:anchorId="042283D5" wp14:editId="0CAC0C33">
-            <wp:extent cx="5048250" cy="3755294"/>
-            <wp:effectExtent l="0" t="0" r="0" b="0"/>
-            <wp:docPr id="1222904046" name="Рисунок 1"/>
+          <wp:inline distT="0" distB="0" distL="0" distR="0" wp14:anchorId="590DB367" wp14:editId="45AC94D3">
+            <wp:extent cx="5940425" cy="4449445"/>
+            <wp:effectExtent l="0" t="0" r="3175" b="8255"/>
+            <wp:docPr id="1108427245" name="Рисунок 1"/>
             <wp:cNvGraphicFramePr>
               <a:graphicFrameLocks xmlns:a="http://schemas.openxmlformats.org/drawingml/2006/main" noChangeAspect="1"/>
             </wp:cNvGraphicFramePr>
@@ -2281,7 +2756,7 @@
               <a:graphicData uri="http://schemas.openxmlformats.org/drawingml/2006/picture">
                 <pic:pic xmlns:pic="http://schemas.openxmlformats.org/drawingml/2006/picture">
                   <pic:nvPicPr>
-                    <pic:cNvPr id="1222904046" name=""/>
+                    <pic:cNvPr id="1108427245" name=""/>
                     <pic:cNvPicPr/>
                   </pic:nvPicPr>
                   <pic:blipFill>
@@ -2293,7 +2768,7 @@
                   <pic:spPr>
                     <a:xfrm>
                       <a:off x="0" y="0"/>
-                      <a:ext cx="5050947" cy="3757300"/>
+                      <a:ext cx="5940425" cy="4449445"/>
                     </a:xfrm>
                     <a:prstGeom prst="rect">
                       <a:avLst/>
@@ -2305,6 +2780,596 @@
           </wp:inline>
         </w:drawing>
       </w:r>
+    </w:p>
+    <w:p>
+      <w:r>
+        <w:lastRenderedPageBreak/>
+        <w:t>4) Точка D (середина по температуре):</w:t>
+      </w:r>
+    </w:p>
+    <w:p>
+      <w:pPr>
+        <w:rPr>
+          <w:lang w:val="en-US"/>
+        </w:rPr>
+      </w:pPr>
+      <w:proofErr w:type="spellStart"/>
+      <w:r>
+        <w:rPr>
+          <w:lang w:val="en-US"/>
+        </w:rPr>
+        <w:t>T_bubble</w:t>
+      </w:r>
+      <w:proofErr w:type="spellEnd"/>
+      <w:r>
+        <w:rPr>
+          <w:lang w:val="en-US"/>
+        </w:rPr>
+        <w:t xml:space="preserve"> = 333.635 K</w:t>
+      </w:r>
+    </w:p>
+    <w:p>
+      <w:pPr>
+        <w:rPr>
+          <w:lang w:val="en-US"/>
+        </w:rPr>
+      </w:pPr>
+      <w:proofErr w:type="spellStart"/>
+      <w:r>
+        <w:rPr>
+          <w:lang w:val="en-US"/>
+        </w:rPr>
+        <w:t>T_dew</w:t>
+      </w:r>
+      <w:proofErr w:type="spellEnd"/>
+      <w:r>
+        <w:rPr>
+          <w:lang w:val="en-US"/>
+        </w:rPr>
+        <w:t xml:space="preserve">    = 338.544 K</w:t>
+      </w:r>
+    </w:p>
+    <w:p>
+      <w:r>
+        <w:t>T_D      = 336.090 K</w:t>
+      </w:r>
+    </w:p>
+    <w:p>
+      <w:r>
+        <w:t>x1       = 0.66435</w:t>
+      </w:r>
+    </w:p>
+    <w:p>
+      <w:r>
+        <w:t>y1       = 0.42161</w:t>
+      </w:r>
+    </w:p>
+    <w:p>
+      <w:r>
+        <w:t>L        = 0.3229</w:t>
+      </w:r>
+    </w:p>
+    <w:p>
+      <w:r>
+        <w:t>V        = 0.6771</w:t>
+      </w:r>
+    </w:p>
+    <w:p/>
+    <w:p>
+      <w:r>
+        <w:t>5) Ошибки по всем экспериментальным точкам:</w:t>
+      </w:r>
+    </w:p>
+    <w:p>
+      <w:r>
+        <w:t xml:space="preserve">Точка 01: T=337.355 K, z=0.00055, 1 фаза (жидкость), </w:t>
+      </w:r>
+      <w:proofErr w:type="spellStart"/>
+      <w:r>
+        <w:t>x_calc</w:t>
+      </w:r>
+      <w:proofErr w:type="spellEnd"/>
+      <w:r>
+        <w:t xml:space="preserve">=0.00055, </w:t>
+      </w:r>
+      <w:proofErr w:type="spellStart"/>
+      <w:r>
+        <w:t>y_calc</w:t>
+      </w:r>
+      <w:proofErr w:type="spellEnd"/>
+      <w:r>
+        <w:t>=0.00000, |</w:t>
+      </w:r>
+      <w:proofErr w:type="spellStart"/>
+      <w:r>
+        <w:t>dx</w:t>
+      </w:r>
+      <w:proofErr w:type="spellEnd"/>
+      <w:r>
+        <w:t>|=0.00045, |</w:t>
+      </w:r>
+      <w:proofErr w:type="spellStart"/>
+      <w:r>
+        <w:t>dy</w:t>
+      </w:r>
+      <w:proofErr w:type="spellEnd"/>
+      <w:r>
+        <w:t>|=0.00100</w:t>
+      </w:r>
+    </w:p>
+    <w:p>
+      <w:r>
+        <w:t xml:space="preserve">Точка 02: T=337.306 K, z=0.00200, 2 фазы, </w:t>
+      </w:r>
+      <w:proofErr w:type="spellStart"/>
+      <w:r>
+        <w:t>x_calc</w:t>
+      </w:r>
+      <w:proofErr w:type="spellEnd"/>
+      <w:r>
+        <w:t xml:space="preserve">=0.00122, </w:t>
+      </w:r>
+      <w:proofErr w:type="spellStart"/>
+      <w:r>
+        <w:t>y_calc</w:t>
+      </w:r>
+      <w:proofErr w:type="spellEnd"/>
+      <w:r>
+        <w:t>=0.00569, |</w:t>
+      </w:r>
+      <w:proofErr w:type="spellStart"/>
+      <w:r>
+        <w:t>dx</w:t>
+      </w:r>
+      <w:proofErr w:type="spellEnd"/>
+      <w:r>
+        <w:t>|=0.00022, |</w:t>
+      </w:r>
+      <w:proofErr w:type="spellStart"/>
+      <w:r>
+        <w:t>dy</w:t>
+      </w:r>
+      <w:proofErr w:type="spellEnd"/>
+      <w:r>
+        <w:t>|=0.00269</w:t>
+      </w:r>
+    </w:p>
+    <w:p>
+      <w:r>
+        <w:t xml:space="preserve">Точка 03: T=337.100 K, z=0.01000, 2 фазы, </w:t>
+      </w:r>
+      <w:proofErr w:type="spellStart"/>
+      <w:r>
+        <w:t>x_calc</w:t>
+      </w:r>
+      <w:proofErr w:type="spellEnd"/>
+      <w:r>
+        <w:t xml:space="preserve">=0.00352, </w:t>
+      </w:r>
+      <w:proofErr w:type="spellStart"/>
+      <w:r>
+        <w:t>y_calc</w:t>
+      </w:r>
+      <w:proofErr w:type="spellEnd"/>
+      <w:r>
+        <w:t>=0.01607, |</w:t>
+      </w:r>
+      <w:proofErr w:type="spellStart"/>
+      <w:r>
+        <w:t>dx</w:t>
+      </w:r>
+      <w:proofErr w:type="spellEnd"/>
+      <w:r>
+        <w:t>|=0.00148, |</w:t>
+      </w:r>
+      <w:proofErr w:type="spellStart"/>
+      <w:r>
+        <w:t>dy</w:t>
+      </w:r>
+      <w:proofErr w:type="spellEnd"/>
+      <w:r>
+        <w:t>|=0.00107</w:t>
+      </w:r>
+    </w:p>
+    <w:p>
+      <w:r>
+        <w:t xml:space="preserve">Точка 04: T=336.866 K, z=0.01950, 2 фазы, </w:t>
+      </w:r>
+      <w:proofErr w:type="spellStart"/>
+      <w:r>
+        <w:t>x_calc</w:t>
+      </w:r>
+      <w:proofErr w:type="spellEnd"/>
+      <w:r>
+        <w:t xml:space="preserve">=0.00627, </w:t>
+      </w:r>
+      <w:proofErr w:type="spellStart"/>
+      <w:r>
+        <w:t>y_calc</w:t>
+      </w:r>
+      <w:proofErr w:type="spellEnd"/>
+      <w:r>
+        <w:t>=0.02781, |</w:t>
+      </w:r>
+      <w:proofErr w:type="spellStart"/>
+      <w:r>
+        <w:t>dx</w:t>
+      </w:r>
+      <w:proofErr w:type="spellEnd"/>
+      <w:r>
+        <w:t>|=0.00373, |</w:t>
+      </w:r>
+      <w:proofErr w:type="spellStart"/>
+      <w:r>
+        <w:t>dy</w:t>
+      </w:r>
+      <w:proofErr w:type="spellEnd"/>
+      <w:r>
+        <w:t>|=0.00119</w:t>
+      </w:r>
+    </w:p>
+    <w:p>
+      <w:r>
+        <w:t xml:space="preserve">Точка 05: T=336.450 K, z=0.03750, 2 фазы, </w:t>
+      </w:r>
+      <w:proofErr w:type="spellStart"/>
+      <w:r>
+        <w:t>x_calc</w:t>
+      </w:r>
+      <w:proofErr w:type="spellEnd"/>
+      <w:r>
+        <w:t xml:space="preserve">=0.01156, </w:t>
+      </w:r>
+      <w:proofErr w:type="spellStart"/>
+      <w:r>
+        <w:t>y_calc</w:t>
+      </w:r>
+      <w:proofErr w:type="spellEnd"/>
+      <w:r>
+        <w:t>=0.04860, |</w:t>
+      </w:r>
+      <w:proofErr w:type="spellStart"/>
+      <w:r>
+        <w:t>dx</w:t>
+      </w:r>
+      <w:proofErr w:type="spellEnd"/>
+      <w:r>
+        <w:t>|=0.00844, |</w:t>
+      </w:r>
+      <w:proofErr w:type="spellStart"/>
+      <w:r>
+        <w:t>dy</w:t>
+      </w:r>
+      <w:proofErr w:type="spellEnd"/>
+      <w:r>
+        <w:t>|=0.00640</w:t>
+      </w:r>
+    </w:p>
+    <w:p>
+      <w:r>
+        <w:t xml:space="preserve">Точка 06: T=335.940 K, z=0.05650, 2 фазы, </w:t>
+      </w:r>
+      <w:proofErr w:type="spellStart"/>
+      <w:r>
+        <w:t>x_calc</w:t>
+      </w:r>
+      <w:proofErr w:type="spellEnd"/>
+      <w:r>
+        <w:t xml:space="preserve">=0.01892, </w:t>
+      </w:r>
+      <w:proofErr w:type="spellStart"/>
+      <w:r>
+        <w:t>y_calc</w:t>
+      </w:r>
+      <w:proofErr w:type="spellEnd"/>
+      <w:r>
+        <w:t>=0.07396, |</w:t>
+      </w:r>
+      <w:proofErr w:type="spellStart"/>
+      <w:r>
+        <w:t>dx</w:t>
+      </w:r>
+      <w:proofErr w:type="spellEnd"/>
+      <w:r>
+        <w:t>|=0.01108, |</w:t>
+      </w:r>
+      <w:proofErr w:type="spellStart"/>
+      <w:r>
+        <w:t>dy</w:t>
+      </w:r>
+      <w:proofErr w:type="spellEnd"/>
+      <w:r>
+        <w:t>|=0.00904</w:t>
+      </w:r>
+    </w:p>
+    <w:p>
+      <w:r>
+        <w:t xml:space="preserve">Точка 07: T=335.350 K, z=0.08150, 2 фазы, </w:t>
+      </w:r>
+      <w:proofErr w:type="spellStart"/>
+      <w:r>
+        <w:t>x_calc</w:t>
+      </w:r>
+      <w:proofErr w:type="spellEnd"/>
+      <w:r>
+        <w:t xml:space="preserve">=0.02905, </w:t>
+      </w:r>
+      <w:proofErr w:type="spellStart"/>
+      <w:r>
+        <w:t>y_calc</w:t>
+      </w:r>
+      <w:proofErr w:type="spellEnd"/>
+      <w:r>
+        <w:t>=0.10326, |</w:t>
+      </w:r>
+      <w:proofErr w:type="spellStart"/>
+      <w:r>
+        <w:t>dx</w:t>
+      </w:r>
+      <w:proofErr w:type="spellEnd"/>
+      <w:r>
+        <w:t>|=0.01595, |</w:t>
+      </w:r>
+      <w:proofErr w:type="spellStart"/>
+      <w:r>
+        <w:t>dy</w:t>
+      </w:r>
+      <w:proofErr w:type="spellEnd"/>
+      <w:r>
+        <w:t>|=0.01474</w:t>
+      </w:r>
+    </w:p>
+    <w:p>
+      <w:r>
+        <w:t xml:space="preserve">Точка 08: T=334.678 K, z=0.10700, 2 фазы, </w:t>
+      </w:r>
+      <w:proofErr w:type="spellStart"/>
+      <w:r>
+        <w:t>x_calc</w:t>
+      </w:r>
+      <w:proofErr w:type="spellEnd"/>
+      <w:r>
+        <w:t xml:space="preserve">=0.04386, </w:t>
+      </w:r>
+      <w:proofErr w:type="spellStart"/>
+      <w:r>
+        <w:t>y_calc</w:t>
+      </w:r>
+      <w:proofErr w:type="spellEnd"/>
+      <w:r>
+        <w:t>=0.13687, |</w:t>
+      </w:r>
+      <w:proofErr w:type="spellStart"/>
+      <w:r>
+        <w:t>dx</w:t>
+      </w:r>
+      <w:proofErr w:type="spellEnd"/>
+      <w:r>
+        <w:t>|=0.01614, |</w:t>
+      </w:r>
+      <w:proofErr w:type="spellStart"/>
+      <w:r>
+        <w:t>dy</w:t>
+      </w:r>
+      <w:proofErr w:type="spellEnd"/>
+      <w:r>
+        <w:t>|=0.01713</w:t>
+      </w:r>
+    </w:p>
+    <w:p>
+      <w:r>
+        <w:t xml:space="preserve">Точка 09: T=333.900 K, z=0.13750, 2 фазы, </w:t>
+      </w:r>
+      <w:proofErr w:type="spellStart"/>
+      <w:r>
+        <w:t>x_calc</w:t>
+      </w:r>
+      <w:proofErr w:type="spellEnd"/>
+      <w:r>
+        <w:t xml:space="preserve">=0.06947, </w:t>
+      </w:r>
+      <w:proofErr w:type="spellStart"/>
+      <w:r>
+        <w:t>y_calc</w:t>
+      </w:r>
+      <w:proofErr w:type="spellEnd"/>
+      <w:r>
+        <w:t>=0.17701, |</w:t>
+      </w:r>
+      <w:proofErr w:type="spellStart"/>
+      <w:r>
+        <w:t>dx</w:t>
+      </w:r>
+      <w:proofErr w:type="spellEnd"/>
+      <w:r>
+        <w:t>|=0.01053, |</w:t>
+      </w:r>
+      <w:proofErr w:type="spellStart"/>
+      <w:r>
+        <w:t>dy</w:t>
+      </w:r>
+      <w:proofErr w:type="spellEnd"/>
+      <w:r>
+        <w:t>|=0.01799</w:t>
+      </w:r>
+    </w:p>
+    <w:p>
+      <w:r>
+        <w:t xml:space="preserve">Точка 10: T=333.211 K, z=0.16700, 2 фазы, </w:t>
+      </w:r>
+      <w:proofErr w:type="spellStart"/>
+      <w:r>
+        <w:t>x_calc</w:t>
+      </w:r>
+      <w:proofErr w:type="spellEnd"/>
+      <w:r>
+        <w:t xml:space="preserve">=0.11440, </w:t>
+      </w:r>
+      <w:proofErr w:type="spellStart"/>
+      <w:r>
+        <w:t>y_calc</w:t>
+      </w:r>
+      <w:proofErr w:type="spellEnd"/>
+      <w:r>
+        <w:t>=0.21650, |</w:t>
+      </w:r>
+      <w:proofErr w:type="spellStart"/>
+      <w:r>
+        <w:t>dx</w:t>
+      </w:r>
+      <w:proofErr w:type="spellEnd"/>
+      <w:r>
+        <w:t>|=0.01440, |</w:t>
+      </w:r>
+      <w:proofErr w:type="spellStart"/>
+      <w:r>
+        <w:t>dy</w:t>
+      </w:r>
+      <w:proofErr w:type="spellEnd"/>
+      <w:r>
+        <w:t>|=0.01750</w:t>
+      </w:r>
+    </w:p>
+    <w:p>
+      <w:r>
+        <w:t xml:space="preserve">Точка 11: T=330.435 K, z=0.29000, 1 фаза (жидкость), </w:t>
+      </w:r>
+      <w:proofErr w:type="spellStart"/>
+      <w:r>
+        <w:t>x_calc</w:t>
+      </w:r>
+      <w:proofErr w:type="spellEnd"/>
+      <w:r>
+        <w:t xml:space="preserve">=0.29000, </w:t>
+      </w:r>
+      <w:proofErr w:type="spellStart"/>
+      <w:r>
+        <w:t>y_calc</w:t>
+      </w:r>
+      <w:proofErr w:type="spellEnd"/>
+      <w:r>
+        <w:t>=0.00000, |</w:t>
+      </w:r>
+      <w:proofErr w:type="spellStart"/>
+      <w:r>
+        <w:t>dx</w:t>
+      </w:r>
+      <w:proofErr w:type="spellEnd"/>
+      <w:r>
+        <w:t>|=0.09000, |</w:t>
+      </w:r>
+      <w:proofErr w:type="spellStart"/>
+      <w:r>
+        <w:t>dy</w:t>
+      </w:r>
+      <w:proofErr w:type="spellEnd"/>
+      <w:r>
+        <w:t>|=0.38000</w:t>
+      </w:r>
+    </w:p>
+    <w:p/>
+    <w:p>
+      <w:r>
+        <w:lastRenderedPageBreak/>
+        <w:t>Средняя абсолютная ошибка по 11 точкам:</w:t>
+      </w:r>
+    </w:p>
+    <w:p>
+      <w:pPr>
+        <w:rPr>
+          <w:lang w:val="en-US"/>
+        </w:rPr>
+      </w:pPr>
+      <w:proofErr w:type="spellStart"/>
+      <w:r>
+        <w:rPr>
+          <w:lang w:val="en-US"/>
+        </w:rPr>
+        <w:t>MAE_x</w:t>
+      </w:r>
+      <w:proofErr w:type="spellEnd"/>
+      <w:r>
+        <w:rPr>
+          <w:lang w:val="en-US"/>
+        </w:rPr>
+        <w:t xml:space="preserve"> = 0.015673</w:t>
+      </w:r>
+    </w:p>
+    <w:p>
+      <w:pPr>
+        <w:rPr>
+          <w:lang w:val="en-US"/>
+        </w:rPr>
+      </w:pPr>
+      <w:proofErr w:type="spellStart"/>
+      <w:r>
+        <w:rPr>
+          <w:lang w:val="en-US"/>
+        </w:rPr>
+        <w:t>MAE_y</w:t>
+      </w:r>
+      <w:proofErr w:type="spellEnd"/>
+      <w:r>
+        <w:rPr>
+          <w:lang w:val="en-US"/>
+        </w:rPr>
+        <w:t xml:space="preserve"> = 0.042612</w:t>
+      </w:r>
+    </w:p>
+    <w:p>
+      <w:pPr>
+        <w:rPr>
+          <w:lang w:val="en-US"/>
+        </w:rPr>
+      </w:pPr>
+    </w:p>
+    <w:p>
+      <w:pPr>
+        <w:rPr>
+          <w:lang w:val="en-US"/>
+        </w:rPr>
+      </w:pPr>
+      <w:r>
+        <w:t>Итог</w:t>
+      </w:r>
+      <w:r>
+        <w:rPr>
+          <w:lang w:val="en-US"/>
+        </w:rPr>
+        <w:t>:</w:t>
+      </w:r>
+    </w:p>
+    <w:p>
+      <w:r>
+        <w:t>1) y-x пересчитана</w:t>
+      </w:r>
+    </w:p>
+    <w:p>
+      <w:r>
+        <w:t>2) P-x-y пересчитана</w:t>
+      </w:r>
+    </w:p>
+    <w:p>
+      <w:r>
+        <w:t>3) T-x-y пересчитана</w:t>
+      </w:r>
+    </w:p>
+    <w:p>
+      <w:r>
+        <w:t>4) Точка D пересчитана</w:t>
+      </w:r>
+    </w:p>
+    <w:p>
+      <w:r>
+        <w:t>5) MAE по 11 точкам пересчитана</w:t>
+      </w:r>
+    </w:p>
+    <w:p>
+      <w:pPr>
+        <w:rPr>
+          <w:lang w:val="en-US"/>
+        </w:rPr>
+      </w:pPr>
     </w:p>
     <w:sectPr>
       <w:pgSz w:w="11906" w:h="16838"/>
@@ -3286,7 +4351,6 @@
   <w:style w:type="character" w:default="1" w:styleId="a0">
     <w:name w:val="Default Paragraph Font"/>
     <w:uiPriority w:val="1"/>
-    <w:semiHidden/>
     <w:unhideWhenUsed/>
   </w:style>
   <w:style w:type="table" w:default="1" w:styleId="a1">

</xml_diff>